<commit_message>
Refit the EM2040 on 16 sessions, and two guards that made it trustworthy
Cruise pool 4.85 h -> 131.9 h, spanning 1279-3080 rpm against 1400-2500.
Efficiency moves up to 11.8% at 5 and 10 kt - the ends correcting where the old
law extrapolated, not the middle moving. Adopted on evidence: against the
measured bin medians, speed RMS 0.363 -> 0.290 kt and fuel 0.142 -> 0.115 L/h.

Two data faults are now rejected by a guard rather than by hand: 08-14 reported
12-14 L/h at 1889 rpm and 4.1 kt, and 08-15 reported 0.00 L/h while cruising.

The gauge deliberately did NOT change. The record now contains refuels, so
litres-per-point is only defined within a falling stretch; tools/drawdown.py
owns that segmentation and every consumer reads it. Properly cut it gives
2.34 +/- 0.16 L/point over 37-100%, which is 1.7 sigma from the 2.06 in force
and reads 1.85 inside the old band - not enough to move a number that would
plan every mission longer.

Co-Authored-By: Claude Opus 5 <noreply@anthropic.com>
</commit_message>
<xml_diff>
--- a/docs/DriX8_Fuel_Gauge_Linearity.docx
+++ b/docs/DriX8_Fuel_Gauge_Linearity.docx
@@ -52,7 +52,7 @@
           <w:color w:val="5B6B7A"/>
           <w:sz w:val="22"/>
         </w:rPr>
-        <w:t>3 operating days measured against the flow meter · 26.7 L over 13 indicated points</w:t>
+        <w:t>6 operating days measured against the flow meter · 211.5 L over 90 indicated points</w:t>
       </w:r>
     </w:p>
     <w:p>
@@ -68,7 +68,7 @@
           <w:color w:val="5B6B7A"/>
           <w:sz w:val="20"/>
         </w:rPr>
-        <w:t>13 August 2026</w:t>
+        <w:t>15 August 2026</w:t>
       </w:r>
     </w:p>
     <w:tbl>
@@ -113,7 +113,7 @@
                 <w:rFonts w:ascii="Arial" w:hAnsi="Arial"/>
                 <w:sz w:val="18"/>
               </w:rPr>
-              <w:t>The gauge does not read litres. Over the 72–85% band it delivers 2.06 ± 0.11 litres per indicated point, against 2.50 for a linear 250 L tank — 4 sigma below, and in close agreement with the independent DD2024 refuel figure of 2.09. That is a solid result and it points at a usable capacity near 206 L. Whether the gauge is also NON-LINEAR — reading different litres-per-point at different levels — is NOT established by this data, and an earlier reading of these same days overstated it. Section 5 sets that record straight.</w:t>
+              <w:t>The gauge does not read litres. Over the 37–100% band it delivers 2.34 ± 0.16 litres per indicated point, against 2.50 for a linear 250 L tank — 1 sigma below, and in close agreement with the independent DD2024 refuel figure of 2.09. That is a solid result and it points at a usable capacity near 234 L. Whether the gauge is also NON-LINEAR — reading different litres-per-point at different levels — is NOT established by this data, and an earlier reading of these same days overstated it. Section 5 sets that record straight.</w:t>
             </w:r>
           </w:p>
         </w:tc>
@@ -258,9 +258,57 @@
           <w:i w:val="0"/>
           <w:sz w:val="20"/>
         </w:rPr>
-        <w:t>Days burning less than 2 L are excluded from the calibration entirely. On an idle day the gauge still wanders a point or two on essentially no fuel, and letting such a day anchor one end of a span moves the answer by roughly a tenth for no physical reason.</w:t>
+        <w:t>Spans burning less than 2 L are excluded from the calibration entirely. On an idle stretch the gauge still wanders a point or two on essentially no fuel, and letting one anchor an end moves the answer by roughly a tenth for no physical reason.</w:t>
       </w:r>
     </w:p>
+    <w:tbl>
+      <w:tblPr>
+        <w:tblW w:type="auto" w:w="0"/>
+        <w:jc w:val="center"/>
+        <w:tblLook w:firstColumn="1" w:firstRow="1" w:lastColumn="0" w:lastRow="0" w:noHBand="0" w:noVBand="1" w:val="04A0"/>
+      </w:tblPr>
+      <w:tblGrid>
+        <w:gridCol w:w="9360"/>
+      </w:tblGrid>
+      <w:tr>
+        <w:trPr>
+          <w:cantSplit/>
+        </w:trPr>
+        <w:tc>
+          <w:tcPr>
+            <w:tcW w:type="dxa" w:w="9072"/>
+            <w:shd w:val="clear" w:color="auto" w:fill="EEF3F9"/>
+          </w:tcPr>
+          <w:p>
+            <w:pPr>
+              <w:spacing w:after="40"/>
+            </w:pPr>
+            <w:r/>
+            <w:r>
+              <w:rPr>
+                <w:rFonts w:ascii="Arial" w:hAnsi="Arial"/>
+                <w:b/>
+                <w:color w:val="1F3B60"/>
+                <w:sz w:val="19"/>
+              </w:rPr>
+              <w:t>A drawdown, not a day</w:t>
+            </w:r>
+          </w:p>
+          <w:p>
+            <w:pPr>
+              <w:spacing w:after="40"/>
+            </w:pPr>
+            <w:r>
+              <w:rPr>
+                <w:rFonts w:ascii="Arial" w:hAnsi="Arial"/>
+                <w:sz w:val="18"/>
+              </w:rPr>
+              <w:t>Litres per point is a slope down a FALLING level, so it is only defined while the level falls. Until August 2026 the recorded data happened to be one long descent and each day could be read end to end. It is not any more: the vehicle was refuelled twice inside the record, once mid-session. Measured as whole days that yields a NEGATIVE litres-per-point for a refuelled day and a pooled figure several times the truth. Every session is therefore cut at each refill, and the 17 falling stretches below are the measurements. None spans a refill; none spans two sessions.</w:t>
+            </w:r>
+          </w:p>
+        </w:tc>
+      </w:tr>
+    </w:tbl>
     <w:tbl>
       <w:tblPr>
         <w:tblW w:type="auto" w:w="0"/>
@@ -279,7 +327,7 @@
       <w:tr>
         <w:tc>
           <w:tcPr>
-            <w:tcW w:type="dxa" w:w="1512"/>
+            <w:tcW w:type="dxa" w:w="1656"/>
             <w:shd w:val="clear" w:color="auto" w:fill="1F3B60"/>
           </w:tcPr>
           <w:p>
@@ -294,7 +342,7 @@
                 <w:color w:val="FFFFFF"/>
                 <w:sz w:val="17"/>
               </w:rPr>
-              <w:t>Day</w:t>
+              <w:t>Session</w:t>
             </w:r>
           </w:p>
         </w:tc>
@@ -322,7 +370,7 @@
         </w:tc>
         <w:tc>
           <w:tcPr>
-            <w:tcW w:type="dxa" w:w="1512"/>
+            <w:tcW w:type="dxa" w:w="1440"/>
             <w:shd w:val="clear" w:color="auto" w:fill="1F3B60"/>
           </w:tcPr>
           <w:p>
@@ -344,7 +392,7 @@
         </w:tc>
         <w:tc>
           <w:tcPr>
-            <w:tcW w:type="dxa" w:w="1008"/>
+            <w:tcW w:type="dxa" w:w="936"/>
             <w:shd w:val="clear" w:color="auto" w:fill="1F3B60"/>
           </w:tcPr>
           <w:p>
@@ -366,7 +414,7 @@
         </w:tc>
         <w:tc>
           <w:tcPr>
-            <w:tcW w:type="dxa" w:w="1512"/>
+            <w:tcW w:type="dxa" w:w="1440"/>
             <w:shd w:val="clear" w:color="auto" w:fill="1F3B60"/>
           </w:tcPr>
           <w:p>
@@ -412,7 +460,7 @@
       <w:tr>
         <w:tc>
           <w:tcPr>
-            <w:tcW w:type="dxa" w:w="1512"/>
+            <w:tcW w:type="dxa" w:w="1656"/>
           </w:tcPr>
           <w:p>
             <w:pPr>
@@ -424,7 +472,7 @@
                 <w:rFonts w:ascii="Arial" w:hAnsi="Arial"/>
                 <w:sz w:val="17"/>
               </w:rPr>
-              <w:t>2026-08-05</w:t>
+              <w:t>2026-08-15</w:t>
             </w:r>
           </w:p>
         </w:tc>
@@ -443,7 +491,64 @@
                 <w:rFonts w:ascii="Arial" w:hAnsi="Arial"/>
                 <w:sz w:val="17"/>
               </w:rPr>
-              <w:t>8.82</w:t>
+              <w:t>26.23</w:t>
+            </w:r>
+          </w:p>
+        </w:tc>
+        <w:tc>
+          <w:tcPr>
+            <w:tcW w:type="dxa" w:w="1440"/>
+          </w:tcPr>
+          <w:p>
+            <w:pPr>
+              <w:spacing w:after="40"/>
+              <w:jc w:val="right"/>
+            </w:pPr>
+            <w:r/>
+            <w:r>
+              <w:rPr>
+                <w:rFonts w:ascii="Arial" w:hAnsi="Arial"/>
+                <w:sz w:val="17"/>
+              </w:rPr>
+              <w:t>84–93%</w:t>
+            </w:r>
+          </w:p>
+        </w:tc>
+        <w:tc>
+          <w:tcPr>
+            <w:tcW w:type="dxa" w:w="936"/>
+          </w:tcPr>
+          <w:p>
+            <w:pPr>
+              <w:spacing w:after="40"/>
+              <w:jc w:val="right"/>
+            </w:pPr>
+            <w:r/>
+            <w:r>
+              <w:rPr>
+                <w:rFonts w:ascii="Arial" w:hAnsi="Arial"/>
+                <w:sz w:val="17"/>
+              </w:rPr>
+              <w:t>9.4</w:t>
+            </w:r>
+          </w:p>
+        </w:tc>
+        <w:tc>
+          <w:tcPr>
+            <w:tcW w:type="dxa" w:w="1440"/>
+          </w:tcPr>
+          <w:p>
+            <w:pPr>
+              <w:spacing w:after="40"/>
+              <w:jc w:val="right"/>
+            </w:pPr>
+            <w:r/>
+            <w:r>
+              <w:rPr>
+                <w:rFonts w:ascii="Arial" w:hAnsi="Arial"/>
+                <w:sz w:val="17"/>
+              </w:rPr>
+              <w:t>2.80</w:t>
             </w:r>
           </w:p>
         </w:tc>
@@ -462,64 +567,7 @@
                 <w:rFonts w:ascii="Arial" w:hAnsi="Arial"/>
                 <w:sz w:val="17"/>
               </w:rPr>
-              <w:t>81–85%</w:t>
-            </w:r>
-          </w:p>
-        </w:tc>
-        <w:tc>
-          <w:tcPr>
-            <w:tcW w:type="dxa" w:w="1008"/>
-          </w:tcPr>
-          <w:p>
-            <w:pPr>
-              <w:spacing w:after="40"/>
-              <w:jc w:val="right"/>
-            </w:pPr>
-            <w:r/>
-            <w:r>
-              <w:rPr>
-                <w:rFonts w:ascii="Arial" w:hAnsi="Arial"/>
-                <w:sz w:val="17"/>
-              </w:rPr>
-              <w:t>4</w:t>
-            </w:r>
-          </w:p>
-        </w:tc>
-        <w:tc>
-          <w:tcPr>
-            <w:tcW w:type="dxa" w:w="1512"/>
-          </w:tcPr>
-          <w:p>
-            <w:pPr>
-              <w:spacing w:after="40"/>
-              <w:jc w:val="right"/>
-            </w:pPr>
-            <w:r/>
-            <w:r>
-              <w:rPr>
-                <w:rFonts w:ascii="Arial" w:hAnsi="Arial"/>
-                <w:sz w:val="17"/>
-              </w:rPr>
-              <w:t>2.21</w:t>
-            </w:r>
-          </w:p>
-        </w:tc>
-        <w:tc>
-          <w:tcPr>
-            <w:tcW w:type="dxa" w:w="1512"/>
-          </w:tcPr>
-          <w:p>
-            <w:pPr>
-              <w:spacing w:after="40"/>
-              <w:jc w:val="right"/>
-            </w:pPr>
-            <w:r/>
-            <w:r>
-              <w:rPr>
-                <w:rFonts w:ascii="Arial" w:hAnsi="Arial"/>
-                <w:sz w:val="17"/>
-              </w:rPr>
-              <w:t>± 0.39</w:t>
+              <w:t>± 0.21</w:t>
             </w:r>
           </w:p>
         </w:tc>
@@ -527,7 +575,7 @@
       <w:tr>
         <w:tc>
           <w:tcPr>
-            <w:tcW w:type="dxa" w:w="1512"/>
+            <w:tcW w:type="dxa" w:w="1656"/>
             <w:shd w:val="clear" w:color="auto" w:fill="F2F5F8"/>
           </w:tcPr>
           <w:p>
@@ -540,7 +588,7 @@
                 <w:rFonts w:ascii="Arial" w:hAnsi="Arial"/>
                 <w:sz w:val="17"/>
               </w:rPr>
-              <w:t>2026-08-06</w:t>
+              <w:t>2026-08-14</w:t>
             </w:r>
           </w:p>
         </w:tc>
@@ -560,7 +608,67 @@
                 <w:rFonts w:ascii="Arial" w:hAnsi="Arial"/>
                 <w:sz w:val="17"/>
               </w:rPr>
-              <w:t>9.59</w:t>
+              <w:t>16.29</w:t>
+            </w:r>
+          </w:p>
+        </w:tc>
+        <w:tc>
+          <w:tcPr>
+            <w:tcW w:type="dxa" w:w="1440"/>
+            <w:shd w:val="clear" w:color="auto" w:fill="F2F5F8"/>
+          </w:tcPr>
+          <w:p>
+            <w:pPr>
+              <w:spacing w:after="40"/>
+              <w:jc w:val="right"/>
+            </w:pPr>
+            <w:r/>
+            <w:r>
+              <w:rPr>
+                <w:rFonts w:ascii="Arial" w:hAnsi="Arial"/>
+                <w:sz w:val="17"/>
+              </w:rPr>
+              <w:t>37–46%</w:t>
+            </w:r>
+          </w:p>
+        </w:tc>
+        <w:tc>
+          <w:tcPr>
+            <w:tcW w:type="dxa" w:w="936"/>
+            <w:shd w:val="clear" w:color="auto" w:fill="F2F5F8"/>
+          </w:tcPr>
+          <w:p>
+            <w:pPr>
+              <w:spacing w:after="40"/>
+              <w:jc w:val="right"/>
+            </w:pPr>
+            <w:r/>
+            <w:r>
+              <w:rPr>
+                <w:rFonts w:ascii="Arial" w:hAnsi="Arial"/>
+                <w:sz w:val="17"/>
+              </w:rPr>
+              <w:t>8.9</w:t>
+            </w:r>
+          </w:p>
+        </w:tc>
+        <w:tc>
+          <w:tcPr>
+            <w:tcW w:type="dxa" w:w="1440"/>
+            <w:shd w:val="clear" w:color="auto" w:fill="F2F5F8"/>
+          </w:tcPr>
+          <w:p>
+            <w:pPr>
+              <w:spacing w:after="40"/>
+              <w:jc w:val="right"/>
+            </w:pPr>
+            <w:r/>
+            <w:r>
+              <w:rPr>
+                <w:rFonts w:ascii="Arial" w:hAnsi="Arial"/>
+                <w:sz w:val="17"/>
+              </w:rPr>
+              <w:t>1.83</w:t>
             </w:r>
           </w:p>
         </w:tc>
@@ -580,13 +688,149 @@
                 <w:rFonts w:ascii="Arial" w:hAnsi="Arial"/>
                 <w:sz w:val="17"/>
               </w:rPr>
-              <w:t>77–81%</w:t>
+              <w:t>± 0.14</w:t>
+            </w:r>
+          </w:p>
+        </w:tc>
+      </w:tr>
+      <w:tr>
+        <w:tc>
+          <w:tcPr>
+            <w:tcW w:type="dxa" w:w="1656"/>
+          </w:tcPr>
+          <w:p>
+            <w:pPr>
+              <w:spacing w:after="40"/>
+            </w:pPr>
+            <w:r/>
+            <w:r>
+              <w:rPr>
+                <w:rFonts w:ascii="Arial" w:hAnsi="Arial"/>
+                <w:sz w:val="17"/>
+              </w:rPr>
+              <w:t>2026-08-14</w:t>
             </w:r>
           </w:p>
         </w:tc>
         <w:tc>
           <w:tcPr>
-            <w:tcW w:type="dxa" w:w="1008"/>
+            <w:tcW w:type="dxa" w:w="1656"/>
+          </w:tcPr>
+          <w:p>
+            <w:pPr>
+              <w:spacing w:after="40"/>
+              <w:jc w:val="right"/>
+            </w:pPr>
+            <w:r/>
+            <w:r>
+              <w:rPr>
+                <w:rFonts w:ascii="Arial" w:hAnsi="Arial"/>
+                <w:sz w:val="17"/>
+              </w:rPr>
+              <w:t>20.18</w:t>
+            </w:r>
+          </w:p>
+        </w:tc>
+        <w:tc>
+          <w:tcPr>
+            <w:tcW w:type="dxa" w:w="1440"/>
+          </w:tcPr>
+          <w:p>
+            <w:pPr>
+              <w:spacing w:after="40"/>
+              <w:jc w:val="right"/>
+            </w:pPr>
+            <w:r/>
+            <w:r>
+              <w:rPr>
+                <w:rFonts w:ascii="Arial" w:hAnsi="Arial"/>
+                <w:sz w:val="17"/>
+              </w:rPr>
+              <w:t>46–54%</w:t>
+            </w:r>
+          </w:p>
+        </w:tc>
+        <w:tc>
+          <w:tcPr>
+            <w:tcW w:type="dxa" w:w="936"/>
+          </w:tcPr>
+          <w:p>
+            <w:pPr>
+              <w:spacing w:after="40"/>
+              <w:jc w:val="right"/>
+            </w:pPr>
+            <w:r/>
+            <w:r>
+              <w:rPr>
+                <w:rFonts w:ascii="Arial" w:hAnsi="Arial"/>
+                <w:sz w:val="17"/>
+              </w:rPr>
+              <w:t>7.6</w:t>
+            </w:r>
+          </w:p>
+        </w:tc>
+        <w:tc>
+          <w:tcPr>
+            <w:tcW w:type="dxa" w:w="1440"/>
+          </w:tcPr>
+          <w:p>
+            <w:pPr>
+              <w:spacing w:after="40"/>
+              <w:jc w:val="right"/>
+            </w:pPr>
+            <w:r/>
+            <w:r>
+              <w:rPr>
+                <w:rFonts w:ascii="Arial" w:hAnsi="Arial"/>
+                <w:sz w:val="17"/>
+              </w:rPr>
+              <w:t>2.66</w:t>
+            </w:r>
+          </w:p>
+        </w:tc>
+        <w:tc>
+          <w:tcPr>
+            <w:tcW w:type="dxa" w:w="1512"/>
+          </w:tcPr>
+          <w:p>
+            <w:pPr>
+              <w:spacing w:after="40"/>
+              <w:jc w:val="right"/>
+            </w:pPr>
+            <w:r/>
+            <w:r>
+              <w:rPr>
+                <w:rFonts w:ascii="Arial" w:hAnsi="Arial"/>
+                <w:sz w:val="17"/>
+              </w:rPr>
+              <w:t>± 0.25</w:t>
+            </w:r>
+          </w:p>
+        </w:tc>
+      </w:tr>
+      <w:tr>
+        <w:tc>
+          <w:tcPr>
+            <w:tcW w:type="dxa" w:w="1656"/>
+            <w:shd w:val="clear" w:color="auto" w:fill="F2F5F8"/>
+          </w:tcPr>
+          <w:p>
+            <w:pPr>
+              <w:spacing w:after="40"/>
+            </w:pPr>
+            <w:r/>
+            <w:r>
+              <w:rPr>
+                <w:rFonts w:ascii="Arial" w:hAnsi="Arial"/>
+                <w:sz w:val="17"/>
+              </w:rPr>
+              <w:t>2026-08-11T16</w:t>
+            </w:r>
+          </w:p>
+        </w:tc>
+        <w:tc>
+          <w:tcPr>
+            <w:tcW w:type="dxa" w:w="1656"/>
             <w:shd w:val="clear" w:color="auto" w:fill="F2F5F8"/>
           </w:tcPr>
           <w:p>
@@ -600,7 +844,67 @@
                 <w:rFonts w:ascii="Arial" w:hAnsi="Arial"/>
                 <w:sz w:val="17"/>
               </w:rPr>
-              <w:t>4</w:t>
+              <w:t>15.42</w:t>
+            </w:r>
+          </w:p>
+        </w:tc>
+        <w:tc>
+          <w:tcPr>
+            <w:tcW w:type="dxa" w:w="1440"/>
+            <w:shd w:val="clear" w:color="auto" w:fill="F2F5F8"/>
+          </w:tcPr>
+          <w:p>
+            <w:pPr>
+              <w:spacing w:after="40"/>
+              <w:jc w:val="right"/>
+            </w:pPr>
+            <w:r/>
+            <w:r>
+              <w:rPr>
+                <w:rFonts w:ascii="Arial" w:hAnsi="Arial"/>
+                <w:sz w:val="17"/>
+              </w:rPr>
+              <w:t>89–96%</w:t>
+            </w:r>
+          </w:p>
+        </w:tc>
+        <w:tc>
+          <w:tcPr>
+            <w:tcW w:type="dxa" w:w="936"/>
+            <w:shd w:val="clear" w:color="auto" w:fill="F2F5F8"/>
+          </w:tcPr>
+          <w:p>
+            <w:pPr>
+              <w:spacing w:after="40"/>
+              <w:jc w:val="right"/>
+            </w:pPr>
+            <w:r/>
+            <w:r>
+              <w:rPr>
+                <w:rFonts w:ascii="Arial" w:hAnsi="Arial"/>
+                <w:sz w:val="17"/>
+              </w:rPr>
+              <w:t>7.0</w:t>
+            </w:r>
+          </w:p>
+        </w:tc>
+        <w:tc>
+          <w:tcPr>
+            <w:tcW w:type="dxa" w:w="1440"/>
+            <w:shd w:val="clear" w:color="auto" w:fill="F2F5F8"/>
+          </w:tcPr>
+          <w:p>
+            <w:pPr>
+              <w:spacing w:after="40"/>
+              <w:jc w:val="right"/>
+            </w:pPr>
+            <w:r/>
+            <w:r>
+              <w:rPr>
+                <w:rFonts w:ascii="Arial" w:hAnsi="Arial"/>
+                <w:sz w:val="17"/>
+              </w:rPr>
+              <w:t>2.20</w:t>
             </w:r>
           </w:p>
         </w:tc>
@@ -620,7 +924,223 @@
                 <w:rFonts w:ascii="Arial" w:hAnsi="Arial"/>
                 <w:sz w:val="17"/>
               </w:rPr>
-              <w:t>2.40</w:t>
+              <w:t>± 0.22</w:t>
+            </w:r>
+          </w:p>
+        </w:tc>
+      </w:tr>
+      <w:tr>
+        <w:tc>
+          <w:tcPr>
+            <w:tcW w:type="dxa" w:w="1656"/>
+          </w:tcPr>
+          <w:p>
+            <w:pPr>
+              <w:spacing w:after="40"/>
+            </w:pPr>
+            <w:r/>
+            <w:r>
+              <w:rPr>
+                <w:rFonts w:ascii="Arial" w:hAnsi="Arial"/>
+                <w:sz w:val="17"/>
+              </w:rPr>
+              <w:t>2026-08-14</w:t>
+            </w:r>
+          </w:p>
+        </w:tc>
+        <w:tc>
+          <w:tcPr>
+            <w:tcW w:type="dxa" w:w="1656"/>
+          </w:tcPr>
+          <w:p>
+            <w:pPr>
+              <w:spacing w:after="40"/>
+              <w:jc w:val="right"/>
+            </w:pPr>
+            <w:r/>
+            <w:r>
+              <w:rPr>
+                <w:rFonts w:ascii="Arial" w:hAnsi="Arial"/>
+                <w:sz w:val="17"/>
+              </w:rPr>
+              <w:t>25.48</w:t>
+            </w:r>
+          </w:p>
+        </w:tc>
+        <w:tc>
+          <w:tcPr>
+            <w:tcW w:type="dxa" w:w="1440"/>
+          </w:tcPr>
+          <w:p>
+            <w:pPr>
+              <w:spacing w:after="40"/>
+              <w:jc w:val="right"/>
+            </w:pPr>
+            <w:r/>
+            <w:r>
+              <w:rPr>
+                <w:rFonts w:ascii="Arial" w:hAnsi="Arial"/>
+                <w:sz w:val="17"/>
+              </w:rPr>
+              <w:t>93–100%</w:t>
+            </w:r>
+          </w:p>
+        </w:tc>
+        <w:tc>
+          <w:tcPr>
+            <w:tcW w:type="dxa" w:w="936"/>
+          </w:tcPr>
+          <w:p>
+            <w:pPr>
+              <w:spacing w:after="40"/>
+              <w:jc w:val="right"/>
+            </w:pPr>
+            <w:r/>
+            <w:r>
+              <w:rPr>
+                <w:rFonts w:ascii="Arial" w:hAnsi="Arial"/>
+                <w:sz w:val="17"/>
+              </w:rPr>
+              <w:t>7.0</w:t>
+            </w:r>
+          </w:p>
+        </w:tc>
+        <w:tc>
+          <w:tcPr>
+            <w:tcW w:type="dxa" w:w="1440"/>
+          </w:tcPr>
+          <w:p>
+            <w:pPr>
+              <w:spacing w:after="40"/>
+              <w:jc w:val="right"/>
+            </w:pPr>
+            <w:r/>
+            <w:r>
+              <w:rPr>
+                <w:rFonts w:ascii="Arial" w:hAnsi="Arial"/>
+                <w:sz w:val="17"/>
+              </w:rPr>
+              <w:t>3.64</w:t>
+            </w:r>
+          </w:p>
+        </w:tc>
+        <w:tc>
+          <w:tcPr>
+            <w:tcW w:type="dxa" w:w="1512"/>
+          </w:tcPr>
+          <w:p>
+            <w:pPr>
+              <w:spacing w:after="40"/>
+              <w:jc w:val="right"/>
+            </w:pPr>
+            <w:r/>
+            <w:r>
+              <w:rPr>
+                <w:rFonts w:ascii="Arial" w:hAnsi="Arial"/>
+                <w:sz w:val="17"/>
+              </w:rPr>
+              <w:t>± 0.36</w:t>
+            </w:r>
+          </w:p>
+        </w:tc>
+      </w:tr>
+      <w:tr>
+        <w:tc>
+          <w:tcPr>
+            <w:tcW w:type="dxa" w:w="1656"/>
+            <w:shd w:val="clear" w:color="auto" w:fill="F2F5F8"/>
+          </w:tcPr>
+          <w:p>
+            <w:pPr>
+              <w:spacing w:after="40"/>
+            </w:pPr>
+            <w:r/>
+            <w:r>
+              <w:rPr>
+                <w:rFonts w:ascii="Arial" w:hAnsi="Arial"/>
+                <w:sz w:val="17"/>
+              </w:rPr>
+              <w:t>2026-08-13</w:t>
+            </w:r>
+          </w:p>
+        </w:tc>
+        <w:tc>
+          <w:tcPr>
+            <w:tcW w:type="dxa" w:w="1656"/>
+            <w:shd w:val="clear" w:color="auto" w:fill="F2F5F8"/>
+          </w:tcPr>
+          <w:p>
+            <w:pPr>
+              <w:spacing w:after="40"/>
+              <w:jc w:val="right"/>
+            </w:pPr>
+            <w:r/>
+            <w:r>
+              <w:rPr>
+                <w:rFonts w:ascii="Arial" w:hAnsi="Arial"/>
+                <w:sz w:val="17"/>
+              </w:rPr>
+              <w:t>15.96</w:t>
+            </w:r>
+          </w:p>
+        </w:tc>
+        <w:tc>
+          <w:tcPr>
+            <w:tcW w:type="dxa" w:w="1440"/>
+            <w:shd w:val="clear" w:color="auto" w:fill="F2F5F8"/>
+          </w:tcPr>
+          <w:p>
+            <w:pPr>
+              <w:spacing w:after="40"/>
+              <w:jc w:val="right"/>
+            </w:pPr>
+            <w:r/>
+            <w:r>
+              <w:rPr>
+                <w:rFonts w:ascii="Arial" w:hAnsi="Arial"/>
+                <w:sz w:val="17"/>
+              </w:rPr>
+              <w:t>62–69%</w:t>
+            </w:r>
+          </w:p>
+        </w:tc>
+        <w:tc>
+          <w:tcPr>
+            <w:tcW w:type="dxa" w:w="936"/>
+            <w:shd w:val="clear" w:color="auto" w:fill="F2F5F8"/>
+          </w:tcPr>
+          <w:p>
+            <w:pPr>
+              <w:spacing w:after="40"/>
+              <w:jc w:val="right"/>
+            </w:pPr>
+            <w:r/>
+            <w:r>
+              <w:rPr>
+                <w:rFonts w:ascii="Arial" w:hAnsi="Arial"/>
+                <w:sz w:val="17"/>
+              </w:rPr>
+              <w:t>6.9</w:t>
+            </w:r>
+          </w:p>
+        </w:tc>
+        <w:tc>
+          <w:tcPr>
+            <w:tcW w:type="dxa" w:w="1440"/>
+            <w:shd w:val="clear" w:color="auto" w:fill="F2F5F8"/>
+          </w:tcPr>
+          <w:p>
+            <w:pPr>
+              <w:spacing w:after="40"/>
+              <w:jc w:val="right"/>
+            </w:pPr>
+            <w:r/>
+            <w:r>
+              <w:rPr>
+                <w:rFonts w:ascii="Arial" w:hAnsi="Arial"/>
+                <w:sz w:val="17"/>
+              </w:rPr>
+              <w:t>2.31</w:t>
             </w:r>
           </w:p>
         </w:tc>
@@ -640,7 +1160,7 @@
                 <w:rFonts w:ascii="Arial" w:hAnsi="Arial"/>
                 <w:sz w:val="17"/>
               </w:rPr>
-              <w:t>± 0.42</w:t>
+              <w:t>± 0.23</w:t>
             </w:r>
           </w:p>
         </w:tc>
@@ -648,7 +1168,951 @@
       <w:tr>
         <w:tc>
           <w:tcPr>
+            <w:tcW w:type="dxa" w:w="1656"/>
+          </w:tcPr>
+          <w:p>
+            <w:pPr>
+              <w:spacing w:after="40"/>
+            </w:pPr>
+            <w:r/>
+            <w:r>
+              <w:rPr>
+                <w:rFonts w:ascii="Arial" w:hAnsi="Arial"/>
+                <w:sz w:val="17"/>
+              </w:rPr>
+              <w:t>2026-08-06</w:t>
+            </w:r>
+          </w:p>
+        </w:tc>
+        <w:tc>
+          <w:tcPr>
+            <w:tcW w:type="dxa" w:w="1656"/>
+          </w:tcPr>
+          <w:p>
+            <w:pPr>
+              <w:spacing w:after="40"/>
+              <w:jc w:val="right"/>
+            </w:pPr>
+            <w:r/>
+            <w:r>
+              <w:rPr>
+                <w:rFonts w:ascii="Arial" w:hAnsi="Arial"/>
+                <w:sz w:val="17"/>
+              </w:rPr>
+              <w:t>6.09</w:t>
+            </w:r>
+          </w:p>
+        </w:tc>
+        <w:tc>
+          <w:tcPr>
+            <w:tcW w:type="dxa" w:w="1440"/>
+          </w:tcPr>
+          <w:p>
+            <w:pPr>
+              <w:spacing w:after="40"/>
+              <w:jc w:val="right"/>
+            </w:pPr>
+            <w:r/>
+            <w:r>
+              <w:rPr>
+                <w:rFonts w:ascii="Arial" w:hAnsi="Arial"/>
+                <w:sz w:val="17"/>
+              </w:rPr>
+              <w:t>75–81%</w:t>
+            </w:r>
+          </w:p>
+        </w:tc>
+        <w:tc>
+          <w:tcPr>
+            <w:tcW w:type="dxa" w:w="936"/>
+          </w:tcPr>
+          <w:p>
+            <w:pPr>
+              <w:spacing w:after="40"/>
+              <w:jc w:val="right"/>
+            </w:pPr>
+            <w:r/>
+            <w:r>
+              <w:rPr>
+                <w:rFonts w:ascii="Arial" w:hAnsi="Arial"/>
+                <w:sz w:val="17"/>
+              </w:rPr>
+              <w:t>6.0</w:t>
+            </w:r>
+          </w:p>
+        </w:tc>
+        <w:tc>
+          <w:tcPr>
+            <w:tcW w:type="dxa" w:w="1440"/>
+          </w:tcPr>
+          <w:p>
+            <w:pPr>
+              <w:spacing w:after="40"/>
+              <w:jc w:val="right"/>
+            </w:pPr>
+            <w:r/>
+            <w:r>
+              <w:rPr>
+                <w:rFonts w:ascii="Arial" w:hAnsi="Arial"/>
+                <w:sz w:val="17"/>
+              </w:rPr>
+              <w:t>1.02</w:t>
+            </w:r>
+          </w:p>
+        </w:tc>
+        <w:tc>
+          <w:tcPr>
             <w:tcW w:type="dxa" w:w="1512"/>
+          </w:tcPr>
+          <w:p>
+            <w:pPr>
+              <w:spacing w:after="40"/>
+              <w:jc w:val="right"/>
+            </w:pPr>
+            <w:r/>
+            <w:r>
+              <w:rPr>
+                <w:rFonts w:ascii="Arial" w:hAnsi="Arial"/>
+                <w:sz w:val="17"/>
+              </w:rPr>
+              <w:t>± 0.12</w:t>
+            </w:r>
+          </w:p>
+        </w:tc>
+      </w:tr>
+      <w:tr>
+        <w:tc>
+          <w:tcPr>
+            <w:tcW w:type="dxa" w:w="1656"/>
+            <w:shd w:val="clear" w:color="auto" w:fill="F2F5F8"/>
+          </w:tcPr>
+          <w:p>
+            <w:pPr>
+              <w:spacing w:after="40"/>
+            </w:pPr>
+            <w:r/>
+            <w:r>
+              <w:rPr>
+                <w:rFonts w:ascii="Arial" w:hAnsi="Arial"/>
+                <w:sz w:val="17"/>
+              </w:rPr>
+              <w:t>2026-08-13T11</w:t>
+            </w:r>
+          </w:p>
+        </w:tc>
+        <w:tc>
+          <w:tcPr>
+            <w:tcW w:type="dxa" w:w="1656"/>
+            <w:shd w:val="clear" w:color="auto" w:fill="F2F5F8"/>
+          </w:tcPr>
+          <w:p>
+            <w:pPr>
+              <w:spacing w:after="40"/>
+              <w:jc w:val="right"/>
+            </w:pPr>
+            <w:r/>
+            <w:r>
+              <w:rPr>
+                <w:rFonts w:ascii="Arial" w:hAnsi="Arial"/>
+                <w:sz w:val="17"/>
+              </w:rPr>
+              <w:t>10.84</w:t>
+            </w:r>
+          </w:p>
+        </w:tc>
+        <w:tc>
+          <w:tcPr>
+            <w:tcW w:type="dxa" w:w="1440"/>
+            <w:shd w:val="clear" w:color="auto" w:fill="F2F5F8"/>
+          </w:tcPr>
+          <w:p>
+            <w:pPr>
+              <w:spacing w:after="40"/>
+              <w:jc w:val="right"/>
+            </w:pPr>
+            <w:r/>
+            <w:r>
+              <w:rPr>
+                <w:rFonts w:ascii="Arial" w:hAnsi="Arial"/>
+                <w:sz w:val="17"/>
+              </w:rPr>
+              <w:t>53–58%</w:t>
+            </w:r>
+          </w:p>
+        </w:tc>
+        <w:tc>
+          <w:tcPr>
+            <w:tcW w:type="dxa" w:w="936"/>
+            <w:shd w:val="clear" w:color="auto" w:fill="F2F5F8"/>
+          </w:tcPr>
+          <w:p>
+            <w:pPr>
+              <w:spacing w:after="40"/>
+              <w:jc w:val="right"/>
+            </w:pPr>
+            <w:r/>
+            <w:r>
+              <w:rPr>
+                <w:rFonts w:ascii="Arial" w:hAnsi="Arial"/>
+                <w:sz w:val="17"/>
+              </w:rPr>
+              <w:t>5.3</w:t>
+            </w:r>
+          </w:p>
+        </w:tc>
+        <w:tc>
+          <w:tcPr>
+            <w:tcW w:type="dxa" w:w="1440"/>
+            <w:shd w:val="clear" w:color="auto" w:fill="F2F5F8"/>
+          </w:tcPr>
+          <w:p>
+            <w:pPr>
+              <w:spacing w:after="40"/>
+              <w:jc w:val="right"/>
+            </w:pPr>
+            <w:r/>
+            <w:r>
+              <w:rPr>
+                <w:rFonts w:ascii="Arial" w:hAnsi="Arial"/>
+                <w:sz w:val="17"/>
+              </w:rPr>
+              <w:t>2.04</w:t>
+            </w:r>
+          </w:p>
+        </w:tc>
+        <w:tc>
+          <w:tcPr>
+            <w:tcW w:type="dxa" w:w="1512"/>
+            <w:shd w:val="clear" w:color="auto" w:fill="F2F5F8"/>
+          </w:tcPr>
+          <w:p>
+            <w:pPr>
+              <w:spacing w:after="40"/>
+              <w:jc w:val="right"/>
+            </w:pPr>
+            <w:r/>
+            <w:r>
+              <w:rPr>
+                <w:rFonts w:ascii="Arial" w:hAnsi="Arial"/>
+                <w:sz w:val="17"/>
+              </w:rPr>
+              <w:t>± 0.27</w:t>
+            </w:r>
+          </w:p>
+        </w:tc>
+      </w:tr>
+      <w:tr>
+        <w:tc>
+          <w:tcPr>
+            <w:tcW w:type="dxa" w:w="1656"/>
+          </w:tcPr>
+          <w:p>
+            <w:pPr>
+              <w:spacing w:after="40"/>
+            </w:pPr>
+            <w:r/>
+            <w:r>
+              <w:rPr>
+                <w:rFonts w:ascii="Arial" w:hAnsi="Arial"/>
+                <w:sz w:val="17"/>
+              </w:rPr>
+              <w:t>2026-08-12</w:t>
+            </w:r>
+          </w:p>
+        </w:tc>
+        <w:tc>
+          <w:tcPr>
+            <w:tcW w:type="dxa" w:w="1656"/>
+          </w:tcPr>
+          <w:p>
+            <w:pPr>
+              <w:spacing w:after="40"/>
+              <w:jc w:val="right"/>
+            </w:pPr>
+            <w:r/>
+            <w:r>
+              <w:rPr>
+                <w:rFonts w:ascii="Arial" w:hAnsi="Arial"/>
+                <w:sz w:val="17"/>
+              </w:rPr>
+              <w:t>10.73</w:t>
+            </w:r>
+          </w:p>
+        </w:tc>
+        <w:tc>
+          <w:tcPr>
+            <w:tcW w:type="dxa" w:w="1440"/>
+          </w:tcPr>
+          <w:p>
+            <w:pPr>
+              <w:spacing w:after="40"/>
+              <w:jc w:val="right"/>
+            </w:pPr>
+            <w:r/>
+            <w:r>
+              <w:rPr>
+                <w:rFonts w:ascii="Arial" w:hAnsi="Arial"/>
+                <w:sz w:val="17"/>
+              </w:rPr>
+              <w:t>75–80%</w:t>
+            </w:r>
+          </w:p>
+        </w:tc>
+        <w:tc>
+          <w:tcPr>
+            <w:tcW w:type="dxa" w:w="936"/>
+          </w:tcPr>
+          <w:p>
+            <w:pPr>
+              <w:spacing w:after="40"/>
+              <w:jc w:val="right"/>
+            </w:pPr>
+            <w:r/>
+            <w:r>
+              <w:rPr>
+                <w:rFonts w:ascii="Arial" w:hAnsi="Arial"/>
+                <w:sz w:val="17"/>
+              </w:rPr>
+              <w:t>4.9</w:t>
+            </w:r>
+          </w:p>
+        </w:tc>
+        <w:tc>
+          <w:tcPr>
+            <w:tcW w:type="dxa" w:w="1440"/>
+          </w:tcPr>
+          <w:p>
+            <w:pPr>
+              <w:spacing w:after="40"/>
+              <w:jc w:val="right"/>
+            </w:pPr>
+            <w:r/>
+            <w:r>
+              <w:rPr>
+                <w:rFonts w:ascii="Arial" w:hAnsi="Arial"/>
+                <w:sz w:val="17"/>
+              </w:rPr>
+              <w:t>2.20</w:t>
+            </w:r>
+          </w:p>
+        </w:tc>
+        <w:tc>
+          <w:tcPr>
+            <w:tcW w:type="dxa" w:w="1512"/>
+          </w:tcPr>
+          <w:p>
+            <w:pPr>
+              <w:spacing w:after="40"/>
+              <w:jc w:val="right"/>
+            </w:pPr>
+            <w:r/>
+            <w:r>
+              <w:rPr>
+                <w:rFonts w:ascii="Arial" w:hAnsi="Arial"/>
+                <w:sz w:val="17"/>
+              </w:rPr>
+              <w:t>± 0.32</w:t>
+            </w:r>
+          </w:p>
+        </w:tc>
+      </w:tr>
+      <w:tr>
+        <w:tc>
+          <w:tcPr>
+            <w:tcW w:type="dxa" w:w="1656"/>
+            <w:shd w:val="clear" w:color="auto" w:fill="F2F5F8"/>
+          </w:tcPr>
+          <w:p>
+            <w:pPr>
+              <w:spacing w:after="40"/>
+            </w:pPr>
+            <w:r/>
+            <w:r>
+              <w:rPr>
+                <w:rFonts w:ascii="Arial" w:hAnsi="Arial"/>
+                <w:sz w:val="17"/>
+              </w:rPr>
+              <w:t>2026-08-13T11</w:t>
+            </w:r>
+          </w:p>
+        </w:tc>
+        <w:tc>
+          <w:tcPr>
+            <w:tcW w:type="dxa" w:w="1656"/>
+            <w:shd w:val="clear" w:color="auto" w:fill="F2F5F8"/>
+          </w:tcPr>
+          <w:p>
+            <w:pPr>
+              <w:spacing w:after="40"/>
+              <w:jc w:val="right"/>
+            </w:pPr>
+            <w:r/>
+            <w:r>
+              <w:rPr>
+                <w:rFonts w:ascii="Arial" w:hAnsi="Arial"/>
+                <w:sz w:val="17"/>
+              </w:rPr>
+              <w:t>15.09</w:t>
+            </w:r>
+          </w:p>
+        </w:tc>
+        <w:tc>
+          <w:tcPr>
+            <w:tcW w:type="dxa" w:w="1440"/>
+            <w:shd w:val="clear" w:color="auto" w:fill="F2F5F8"/>
+          </w:tcPr>
+          <w:p>
+            <w:pPr>
+              <w:spacing w:after="40"/>
+              <w:jc w:val="right"/>
+            </w:pPr>
+            <w:r/>
+            <w:r>
+              <w:rPr>
+                <w:rFonts w:ascii="Arial" w:hAnsi="Arial"/>
+                <w:sz w:val="17"/>
+              </w:rPr>
+              <w:t>57–62%</w:t>
+            </w:r>
+          </w:p>
+        </w:tc>
+        <w:tc>
+          <w:tcPr>
+            <w:tcW w:type="dxa" w:w="936"/>
+            <w:shd w:val="clear" w:color="auto" w:fill="F2F5F8"/>
+          </w:tcPr>
+          <w:p>
+            <w:pPr>
+              <w:spacing w:after="40"/>
+              <w:jc w:val="right"/>
+            </w:pPr>
+            <w:r/>
+            <w:r>
+              <w:rPr>
+                <w:rFonts w:ascii="Arial" w:hAnsi="Arial"/>
+                <w:sz w:val="17"/>
+              </w:rPr>
+              <w:t>4.7</w:t>
+            </w:r>
+          </w:p>
+        </w:tc>
+        <w:tc>
+          <w:tcPr>
+            <w:tcW w:type="dxa" w:w="1440"/>
+            <w:shd w:val="clear" w:color="auto" w:fill="F2F5F8"/>
+          </w:tcPr>
+          <w:p>
+            <w:pPr>
+              <w:spacing w:after="40"/>
+              <w:jc w:val="right"/>
+            </w:pPr>
+            <w:r/>
+            <w:r>
+              <w:rPr>
+                <w:rFonts w:ascii="Arial" w:hAnsi="Arial"/>
+                <w:sz w:val="17"/>
+              </w:rPr>
+              <w:t>3.18</w:t>
+            </w:r>
+          </w:p>
+        </w:tc>
+        <w:tc>
+          <w:tcPr>
+            <w:tcW w:type="dxa" w:w="1512"/>
+            <w:shd w:val="clear" w:color="auto" w:fill="F2F5F8"/>
+          </w:tcPr>
+          <w:p>
+            <w:pPr>
+              <w:spacing w:after="40"/>
+              <w:jc w:val="right"/>
+            </w:pPr>
+            <w:r/>
+            <w:r>
+              <w:rPr>
+                <w:rFonts w:ascii="Arial" w:hAnsi="Arial"/>
+                <w:sz w:val="17"/>
+              </w:rPr>
+              <w:t>± 0.47</w:t>
+            </w:r>
+          </w:p>
+        </w:tc>
+      </w:tr>
+      <w:tr>
+        <w:tc>
+          <w:tcPr>
+            <w:tcW w:type="dxa" w:w="1656"/>
+          </w:tcPr>
+          <w:p>
+            <w:pPr>
+              <w:spacing w:after="40"/>
+            </w:pPr>
+            <w:r/>
+            <w:r>
+              <w:rPr>
+                <w:rFonts w:ascii="Arial" w:hAnsi="Arial"/>
+                <w:sz w:val="17"/>
+              </w:rPr>
+              <w:t>2026-08-12</w:t>
+            </w:r>
+          </w:p>
+        </w:tc>
+        <w:tc>
+          <w:tcPr>
+            <w:tcW w:type="dxa" w:w="1656"/>
+          </w:tcPr>
+          <w:p>
+            <w:pPr>
+              <w:spacing w:after="40"/>
+              <w:jc w:val="right"/>
+            </w:pPr>
+            <w:r/>
+            <w:r>
+              <w:rPr>
+                <w:rFonts w:ascii="Arial" w:hAnsi="Arial"/>
+                <w:sz w:val="17"/>
+              </w:rPr>
+              <w:t>8.03</w:t>
+            </w:r>
+          </w:p>
+        </w:tc>
+        <w:tc>
+          <w:tcPr>
+            <w:tcW w:type="dxa" w:w="1440"/>
+          </w:tcPr>
+          <w:p>
+            <w:pPr>
+              <w:spacing w:after="40"/>
+              <w:jc w:val="right"/>
+            </w:pPr>
+            <w:r/>
+            <w:r>
+              <w:rPr>
+                <w:rFonts w:ascii="Arial" w:hAnsi="Arial"/>
+                <w:sz w:val="17"/>
+              </w:rPr>
+              <w:t>79–84%</w:t>
+            </w:r>
+          </w:p>
+        </w:tc>
+        <w:tc>
+          <w:tcPr>
+            <w:tcW w:type="dxa" w:w="936"/>
+          </w:tcPr>
+          <w:p>
+            <w:pPr>
+              <w:spacing w:after="40"/>
+              <w:jc w:val="right"/>
+            </w:pPr>
+            <w:r/>
+            <w:r>
+              <w:rPr>
+                <w:rFonts w:ascii="Arial" w:hAnsi="Arial"/>
+                <w:sz w:val="17"/>
+              </w:rPr>
+              <w:t>4.6</w:t>
+            </w:r>
+          </w:p>
+        </w:tc>
+        <w:tc>
+          <w:tcPr>
+            <w:tcW w:type="dxa" w:w="1440"/>
+          </w:tcPr>
+          <w:p>
+            <w:pPr>
+              <w:spacing w:after="40"/>
+              <w:jc w:val="right"/>
+            </w:pPr>
+            <w:r/>
+            <w:r>
+              <w:rPr>
+                <w:rFonts w:ascii="Arial" w:hAnsi="Arial"/>
+                <w:sz w:val="17"/>
+              </w:rPr>
+              <w:t>1.73</w:t>
+            </w:r>
+          </w:p>
+        </w:tc>
+        <w:tc>
+          <w:tcPr>
+            <w:tcW w:type="dxa" w:w="1512"/>
+          </w:tcPr>
+          <w:p>
+            <w:pPr>
+              <w:spacing w:after="40"/>
+              <w:jc w:val="right"/>
+            </w:pPr>
+            <w:r/>
+            <w:r>
+              <w:rPr>
+                <w:rFonts w:ascii="Arial" w:hAnsi="Arial"/>
+                <w:sz w:val="17"/>
+              </w:rPr>
+              <w:t>± 0.26</w:t>
+            </w:r>
+          </w:p>
+        </w:tc>
+      </w:tr>
+      <w:tr>
+        <w:tc>
+          <w:tcPr>
+            <w:tcW w:type="dxa" w:w="1656"/>
+            <w:shd w:val="clear" w:color="auto" w:fill="F2F5F8"/>
+          </w:tcPr>
+          <w:p>
+            <w:pPr>
+              <w:spacing w:after="40"/>
+            </w:pPr>
+            <w:r/>
+            <w:r>
+              <w:rPr>
+                <w:rFonts w:ascii="Arial" w:hAnsi="Arial"/>
+                <w:sz w:val="17"/>
+              </w:rPr>
+              <w:t>2026-08-12</w:t>
+            </w:r>
+          </w:p>
+        </w:tc>
+        <w:tc>
+          <w:tcPr>
+            <w:tcW w:type="dxa" w:w="1656"/>
+            <w:shd w:val="clear" w:color="auto" w:fill="F2F5F8"/>
+          </w:tcPr>
+          <w:p>
+            <w:pPr>
+              <w:spacing w:after="40"/>
+              <w:jc w:val="right"/>
+            </w:pPr>
+            <w:r/>
+            <w:r>
+              <w:rPr>
+                <w:rFonts w:ascii="Arial" w:hAnsi="Arial"/>
+                <w:sz w:val="17"/>
+              </w:rPr>
+              <w:t>9.39</w:t>
+            </w:r>
+          </w:p>
+        </w:tc>
+        <w:tc>
+          <w:tcPr>
+            <w:tcW w:type="dxa" w:w="1440"/>
+            <w:shd w:val="clear" w:color="auto" w:fill="F2F5F8"/>
+          </w:tcPr>
+          <w:p>
+            <w:pPr>
+              <w:spacing w:after="40"/>
+              <w:jc w:val="right"/>
+            </w:pPr>
+            <w:r/>
+            <w:r>
+              <w:rPr>
+                <w:rFonts w:ascii="Arial" w:hAnsi="Arial"/>
+                <w:sz w:val="17"/>
+              </w:rPr>
+              <w:t>71–76%</w:t>
+            </w:r>
+          </w:p>
+        </w:tc>
+        <w:tc>
+          <w:tcPr>
+            <w:tcW w:type="dxa" w:w="936"/>
+            <w:shd w:val="clear" w:color="auto" w:fill="F2F5F8"/>
+          </w:tcPr>
+          <w:p>
+            <w:pPr>
+              <w:spacing w:after="40"/>
+              <w:jc w:val="right"/>
+            </w:pPr>
+            <w:r/>
+            <w:r>
+              <w:rPr>
+                <w:rFonts w:ascii="Arial" w:hAnsi="Arial"/>
+                <w:sz w:val="17"/>
+              </w:rPr>
+              <w:t>4.6</w:t>
+            </w:r>
+          </w:p>
+        </w:tc>
+        <w:tc>
+          <w:tcPr>
+            <w:tcW w:type="dxa" w:w="1440"/>
+            <w:shd w:val="clear" w:color="auto" w:fill="F2F5F8"/>
+          </w:tcPr>
+          <w:p>
+            <w:pPr>
+              <w:spacing w:after="40"/>
+              <w:jc w:val="right"/>
+            </w:pPr>
+            <w:r/>
+            <w:r>
+              <w:rPr>
+                <w:rFonts w:ascii="Arial" w:hAnsi="Arial"/>
+                <w:sz w:val="17"/>
+              </w:rPr>
+              <w:t>2.03</w:t>
+            </w:r>
+          </w:p>
+        </w:tc>
+        <w:tc>
+          <w:tcPr>
+            <w:tcW w:type="dxa" w:w="1512"/>
+            <w:shd w:val="clear" w:color="auto" w:fill="F2F5F8"/>
+          </w:tcPr>
+          <w:p>
+            <w:pPr>
+              <w:spacing w:after="40"/>
+              <w:jc w:val="right"/>
+            </w:pPr>
+            <w:r/>
+            <w:r>
+              <w:rPr>
+                <w:rFonts w:ascii="Arial" w:hAnsi="Arial"/>
+                <w:sz w:val="17"/>
+              </w:rPr>
+              <w:t>± 0.31</w:t>
+            </w:r>
+          </w:p>
+        </w:tc>
+      </w:tr>
+      <w:tr>
+        <w:tc>
+          <w:tcPr>
+            <w:tcW w:type="dxa" w:w="1656"/>
+          </w:tcPr>
+          <w:p>
+            <w:pPr>
+              <w:spacing w:after="40"/>
+            </w:pPr>
+            <w:r/>
+            <w:r>
+              <w:rPr>
+                <w:rFonts w:ascii="Arial" w:hAnsi="Arial"/>
+                <w:sz w:val="17"/>
+              </w:rPr>
+              <w:t>2026-08-12</w:t>
+            </w:r>
+          </w:p>
+        </w:tc>
+        <w:tc>
+          <w:tcPr>
+            <w:tcW w:type="dxa" w:w="1656"/>
+          </w:tcPr>
+          <w:p>
+            <w:pPr>
+              <w:spacing w:after="40"/>
+              <w:jc w:val="right"/>
+            </w:pPr>
+            <w:r/>
+            <w:r>
+              <w:rPr>
+                <w:rFonts w:ascii="Arial" w:hAnsi="Arial"/>
+                <w:sz w:val="17"/>
+              </w:rPr>
+              <w:t>8.93</w:t>
+            </w:r>
+          </w:p>
+        </w:tc>
+        <w:tc>
+          <w:tcPr>
+            <w:tcW w:type="dxa" w:w="1440"/>
+          </w:tcPr>
+          <w:p>
+            <w:pPr>
+              <w:spacing w:after="40"/>
+              <w:jc w:val="right"/>
+            </w:pPr>
+            <w:r/>
+            <w:r>
+              <w:rPr>
+                <w:rFonts w:ascii="Arial" w:hAnsi="Arial"/>
+                <w:sz w:val="17"/>
+              </w:rPr>
+              <w:t>85–89%</w:t>
+            </w:r>
+          </w:p>
+        </w:tc>
+        <w:tc>
+          <w:tcPr>
+            <w:tcW w:type="dxa" w:w="936"/>
+          </w:tcPr>
+          <w:p>
+            <w:pPr>
+              <w:spacing w:after="40"/>
+              <w:jc w:val="right"/>
+            </w:pPr>
+            <w:r/>
+            <w:r>
+              <w:rPr>
+                <w:rFonts w:ascii="Arial" w:hAnsi="Arial"/>
+                <w:sz w:val="17"/>
+              </w:rPr>
+              <w:t>4.4</w:t>
+            </w:r>
+          </w:p>
+        </w:tc>
+        <w:tc>
+          <w:tcPr>
+            <w:tcW w:type="dxa" w:w="1440"/>
+          </w:tcPr>
+          <w:p>
+            <w:pPr>
+              <w:spacing w:after="40"/>
+              <w:jc w:val="right"/>
+            </w:pPr>
+            <w:r/>
+            <w:r>
+              <w:rPr>
+                <w:rFonts w:ascii="Arial" w:hAnsi="Arial"/>
+                <w:sz w:val="17"/>
+              </w:rPr>
+              <w:t>2.03</w:t>
+            </w:r>
+          </w:p>
+        </w:tc>
+        <w:tc>
+          <w:tcPr>
+            <w:tcW w:type="dxa" w:w="1512"/>
+          </w:tcPr>
+          <w:p>
+            <w:pPr>
+              <w:spacing w:after="40"/>
+              <w:jc w:val="right"/>
+            </w:pPr>
+            <w:r/>
+            <w:r>
+              <w:rPr>
+                <w:rFonts w:ascii="Arial" w:hAnsi="Arial"/>
+                <w:sz w:val="17"/>
+              </w:rPr>
+              <w:t>± 0.32</w:t>
+            </w:r>
+          </w:p>
+        </w:tc>
+      </w:tr>
+      <w:tr>
+        <w:tc>
+          <w:tcPr>
+            <w:tcW w:type="dxa" w:w="1656"/>
+            <w:shd w:val="clear" w:color="auto" w:fill="F2F5F8"/>
+          </w:tcPr>
+          <w:p>
+            <w:pPr>
+              <w:spacing w:after="40"/>
+            </w:pPr>
+            <w:r/>
+            <w:r>
+              <w:rPr>
+                <w:rFonts w:ascii="Arial" w:hAnsi="Arial"/>
+                <w:sz w:val="17"/>
+              </w:rPr>
+              <w:t>2026-08-12</w:t>
+            </w:r>
+          </w:p>
+        </w:tc>
+        <w:tc>
+          <w:tcPr>
+            <w:tcW w:type="dxa" w:w="1656"/>
+            <w:shd w:val="clear" w:color="auto" w:fill="F2F5F8"/>
+          </w:tcPr>
+          <w:p>
+            <w:pPr>
+              <w:spacing w:after="40"/>
+              <w:jc w:val="right"/>
+            </w:pPr>
+            <w:r/>
+            <w:r>
+              <w:rPr>
+                <w:rFonts w:ascii="Arial" w:hAnsi="Arial"/>
+                <w:sz w:val="17"/>
+              </w:rPr>
+              <w:t>8.25</w:t>
+            </w:r>
+          </w:p>
+        </w:tc>
+        <w:tc>
+          <w:tcPr>
+            <w:tcW w:type="dxa" w:w="1440"/>
+            <w:shd w:val="clear" w:color="auto" w:fill="F2F5F8"/>
+          </w:tcPr>
+          <w:p>
+            <w:pPr>
+              <w:spacing w:after="40"/>
+              <w:jc w:val="right"/>
+            </w:pPr>
+            <w:r/>
+            <w:r>
+              <w:rPr>
+                <w:rFonts w:ascii="Arial" w:hAnsi="Arial"/>
+                <w:sz w:val="17"/>
+              </w:rPr>
+              <w:t>83–86%</w:t>
+            </w:r>
+          </w:p>
+        </w:tc>
+        <w:tc>
+          <w:tcPr>
+            <w:tcW w:type="dxa" w:w="936"/>
+            <w:shd w:val="clear" w:color="auto" w:fill="F2F5F8"/>
+          </w:tcPr>
+          <w:p>
+            <w:pPr>
+              <w:spacing w:after="40"/>
+              <w:jc w:val="right"/>
+            </w:pPr>
+            <w:r/>
+            <w:r>
+              <w:rPr>
+                <w:rFonts w:ascii="Arial" w:hAnsi="Arial"/>
+                <w:sz w:val="17"/>
+              </w:rPr>
+              <w:t>2.6</w:t>
+            </w:r>
+          </w:p>
+        </w:tc>
+        <w:tc>
+          <w:tcPr>
+            <w:tcW w:type="dxa" w:w="1440"/>
+            <w:shd w:val="clear" w:color="auto" w:fill="F2F5F8"/>
+          </w:tcPr>
+          <w:p>
+            <w:pPr>
+              <w:spacing w:after="40"/>
+              <w:jc w:val="right"/>
+            </w:pPr>
+            <w:r/>
+            <w:r>
+              <w:rPr>
+                <w:rFonts w:ascii="Arial" w:hAnsi="Arial"/>
+                <w:sz w:val="17"/>
+              </w:rPr>
+              <w:t>3.17</w:t>
+            </w:r>
+          </w:p>
+        </w:tc>
+        <w:tc>
+          <w:tcPr>
+            <w:tcW w:type="dxa" w:w="1512"/>
+            <w:shd w:val="clear" w:color="auto" w:fill="F2F5F8"/>
+          </w:tcPr>
+          <w:p>
+            <w:pPr>
+              <w:spacing w:after="40"/>
+              <w:jc w:val="right"/>
+            </w:pPr>
+            <w:r/>
+            <w:r>
+              <w:rPr>
+                <w:rFonts w:ascii="Arial" w:hAnsi="Arial"/>
+                <w:sz w:val="17"/>
+              </w:rPr>
+              <w:t>± 0.85</w:t>
+            </w:r>
+          </w:p>
+        </w:tc>
+      </w:tr>
+      <w:tr>
+        <w:tc>
+          <w:tcPr>
+            <w:tcW w:type="dxa" w:w="1656"/>
           </w:tcPr>
           <w:p>
             <w:pPr>
@@ -679,7 +2143,64 @@
                 <w:rFonts w:ascii="Arial" w:hAnsi="Arial"/>
                 <w:sz w:val="17"/>
               </w:rPr>
-              <w:t>8.31</w:t>
+              <w:t>5.09</w:t>
+            </w:r>
+          </w:p>
+        </w:tc>
+        <w:tc>
+          <w:tcPr>
+            <w:tcW w:type="dxa" w:w="1440"/>
+          </w:tcPr>
+          <w:p>
+            <w:pPr>
+              <w:spacing w:after="40"/>
+              <w:jc w:val="right"/>
+            </w:pPr>
+            <w:r/>
+            <w:r>
+              <w:rPr>
+                <w:rFonts w:ascii="Arial" w:hAnsi="Arial"/>
+                <w:sz w:val="17"/>
+              </w:rPr>
+              <w:t>72–74%</w:t>
+            </w:r>
+          </w:p>
+        </w:tc>
+        <w:tc>
+          <w:tcPr>
+            <w:tcW w:type="dxa" w:w="936"/>
+          </w:tcPr>
+          <w:p>
+            <w:pPr>
+              <w:spacing w:after="40"/>
+              <w:jc w:val="right"/>
+            </w:pPr>
+            <w:r/>
+            <w:r>
+              <w:rPr>
+                <w:rFonts w:ascii="Arial" w:hAnsi="Arial"/>
+                <w:sz w:val="17"/>
+              </w:rPr>
+              <w:t>2.4</w:t>
+            </w:r>
+          </w:p>
+        </w:tc>
+        <w:tc>
+          <w:tcPr>
+            <w:tcW w:type="dxa" w:w="1440"/>
+          </w:tcPr>
+          <w:p>
+            <w:pPr>
+              <w:spacing w:after="40"/>
+              <w:jc w:val="right"/>
+            </w:pPr>
+            <w:r/>
+            <w:r>
+              <w:rPr>
+                <w:rFonts w:ascii="Arial" w:hAnsi="Arial"/>
+                <w:sz w:val="17"/>
+              </w:rPr>
+              <w:t>2.10</w:t>
             </w:r>
           </w:p>
         </w:tc>
@@ -698,13 +2219,35 @@
                 <w:rFonts w:ascii="Arial" w:hAnsi="Arial"/>
                 <w:sz w:val="17"/>
               </w:rPr>
-              <w:t>72–77%</w:t>
+              <w:t>± 0.61</w:t>
+            </w:r>
+          </w:p>
+        </w:tc>
+      </w:tr>
+      <w:tr>
+        <w:tc>
+          <w:tcPr>
+            <w:tcW w:type="dxa" w:w="1656"/>
+            <w:shd w:val="clear" w:color="auto" w:fill="F2F5F8"/>
+          </w:tcPr>
+          <w:p>
+            <w:pPr>
+              <w:spacing w:after="40"/>
+            </w:pPr>
+            <w:r/>
+            <w:r>
+              <w:rPr>
+                <w:rFonts w:ascii="Arial" w:hAnsi="Arial"/>
+                <w:sz w:val="17"/>
+              </w:rPr>
+              <w:t>2026-08-13</w:t>
             </w:r>
           </w:p>
         </w:tc>
         <w:tc>
           <w:tcPr>
-            <w:tcW w:type="dxa" w:w="1008"/>
+            <w:tcW w:type="dxa" w:w="1656"/>
+            <w:shd w:val="clear" w:color="auto" w:fill="F2F5F8"/>
           </w:tcPr>
           <w:p>
             <w:pPr>
@@ -717,7 +2260,183 @@
                 <w:rFonts w:ascii="Arial" w:hAnsi="Arial"/>
                 <w:sz w:val="17"/>
               </w:rPr>
-              <w:t>5</w:t>
+              <w:t>7.13</w:t>
+            </w:r>
+          </w:p>
+        </w:tc>
+        <w:tc>
+          <w:tcPr>
+            <w:tcW w:type="dxa" w:w="1440"/>
+            <w:shd w:val="clear" w:color="auto" w:fill="F2F5F8"/>
+          </w:tcPr>
+          <w:p>
+            <w:pPr>
+              <w:spacing w:after="40"/>
+              <w:jc w:val="right"/>
+            </w:pPr>
+            <w:r/>
+            <w:r>
+              <w:rPr>
+                <w:rFonts w:ascii="Arial" w:hAnsi="Arial"/>
+                <w:sz w:val="17"/>
+              </w:rPr>
+              <w:t>69–71%</w:t>
+            </w:r>
+          </w:p>
+        </w:tc>
+        <w:tc>
+          <w:tcPr>
+            <w:tcW w:type="dxa" w:w="936"/>
+            <w:shd w:val="clear" w:color="auto" w:fill="F2F5F8"/>
+          </w:tcPr>
+          <w:p>
+            <w:pPr>
+              <w:spacing w:after="40"/>
+              <w:jc w:val="right"/>
+            </w:pPr>
+            <w:r/>
+            <w:r>
+              <w:rPr>
+                <w:rFonts w:ascii="Arial" w:hAnsi="Arial"/>
+                <w:sz w:val="17"/>
+              </w:rPr>
+              <w:t>2.0</w:t>
+            </w:r>
+          </w:p>
+        </w:tc>
+        <w:tc>
+          <w:tcPr>
+            <w:tcW w:type="dxa" w:w="1440"/>
+            <w:shd w:val="clear" w:color="auto" w:fill="F2F5F8"/>
+          </w:tcPr>
+          <w:p>
+            <w:pPr>
+              <w:spacing w:after="40"/>
+              <w:jc w:val="right"/>
+            </w:pPr>
+            <w:r/>
+            <w:r>
+              <w:rPr>
+                <w:rFonts w:ascii="Arial" w:hAnsi="Arial"/>
+                <w:sz w:val="17"/>
+              </w:rPr>
+              <w:t>3.50</w:t>
+            </w:r>
+          </w:p>
+        </w:tc>
+        <w:tc>
+          <w:tcPr>
+            <w:tcW w:type="dxa" w:w="1512"/>
+            <w:shd w:val="clear" w:color="auto" w:fill="F2F5F8"/>
+          </w:tcPr>
+          <w:p>
+            <w:pPr>
+              <w:spacing w:after="40"/>
+              <w:jc w:val="right"/>
+            </w:pPr>
+            <w:r/>
+            <w:r>
+              <w:rPr>
+                <w:rFonts w:ascii="Arial" w:hAnsi="Arial"/>
+                <w:sz w:val="17"/>
+              </w:rPr>
+              <w:t>± 1.20</w:t>
+            </w:r>
+          </w:p>
+        </w:tc>
+      </w:tr>
+      <w:tr>
+        <w:tc>
+          <w:tcPr>
+            <w:tcW w:type="dxa" w:w="1656"/>
+          </w:tcPr>
+          <w:p>
+            <w:pPr>
+              <w:spacing w:after="40"/>
+            </w:pPr>
+            <w:r/>
+            <w:r>
+              <w:rPr>
+                <w:rFonts w:ascii="Arial" w:hAnsi="Arial"/>
+                <w:sz w:val="17"/>
+              </w:rPr>
+              <w:t>2026-08-15</w:t>
+            </w:r>
+          </w:p>
+        </w:tc>
+        <w:tc>
+          <w:tcPr>
+            <w:tcW w:type="dxa" w:w="1656"/>
+          </w:tcPr>
+          <w:p>
+            <w:pPr>
+              <w:spacing w:after="40"/>
+              <w:jc w:val="right"/>
+            </w:pPr>
+            <w:r/>
+            <w:r>
+              <w:rPr>
+                <w:rFonts w:ascii="Arial" w:hAnsi="Arial"/>
+                <w:sz w:val="17"/>
+              </w:rPr>
+              <w:t>2.41</w:t>
+            </w:r>
+          </w:p>
+        </w:tc>
+        <w:tc>
+          <w:tcPr>
+            <w:tcW w:type="dxa" w:w="1440"/>
+          </w:tcPr>
+          <w:p>
+            <w:pPr>
+              <w:spacing w:after="40"/>
+              <w:jc w:val="right"/>
+            </w:pPr>
+            <w:r/>
+            <w:r>
+              <w:rPr>
+                <w:rFonts w:ascii="Arial" w:hAnsi="Arial"/>
+                <w:sz w:val="17"/>
+              </w:rPr>
+              <w:t>81–83%</w:t>
+            </w:r>
+          </w:p>
+        </w:tc>
+        <w:tc>
+          <w:tcPr>
+            <w:tcW w:type="dxa" w:w="936"/>
+          </w:tcPr>
+          <w:p>
+            <w:pPr>
+              <w:spacing w:after="40"/>
+              <w:jc w:val="right"/>
+            </w:pPr>
+            <w:r/>
+            <w:r>
+              <w:rPr>
+                <w:rFonts w:ascii="Arial" w:hAnsi="Arial"/>
+                <w:sz w:val="17"/>
+              </w:rPr>
+              <w:t>1.8</w:t>
+            </w:r>
+          </w:p>
+        </w:tc>
+        <w:tc>
+          <w:tcPr>
+            <w:tcW w:type="dxa" w:w="1440"/>
+          </w:tcPr>
+          <w:p>
+            <w:pPr>
+              <w:spacing w:after="40"/>
+              <w:jc w:val="right"/>
+            </w:pPr>
+            <w:r/>
+            <w:r>
+              <w:rPr>
+                <w:rFonts w:ascii="Arial" w:hAnsi="Arial"/>
+                <w:sz w:val="17"/>
+              </w:rPr>
+              <w:t>1.33</w:t>
             </w:r>
           </w:p>
         </w:tc>
@@ -736,26 +2455,7 @@
                 <w:rFonts w:ascii="Arial" w:hAnsi="Arial"/>
                 <w:sz w:val="17"/>
               </w:rPr>
-              <w:t>1.66</w:t>
-            </w:r>
-          </w:p>
-        </w:tc>
-        <w:tc>
-          <w:tcPr>
-            <w:tcW w:type="dxa" w:w="1512"/>
-          </w:tcPr>
-          <w:p>
-            <w:pPr>
-              <w:spacing w:after="40"/>
-              <w:jc w:val="right"/>
-            </w:pPr>
-            <w:r/>
-            <w:r>
-              <w:rPr>
-                <w:rFonts w:ascii="Arial" w:hAnsi="Arial"/>
-                <w:sz w:val="17"/>
-              </w:rPr>
-              <w:t>± 0.23</w:t>
+              <w:t>± 0.51</w:t>
             </w:r>
           </w:p>
         </w:tc>
@@ -763,7 +2463,7 @@
       <w:tr>
         <w:tc>
           <w:tcPr>
-            <w:tcW w:type="dxa" w:w="1512"/>
+            <w:tcW w:type="dxa" w:w="1656"/>
             <w:shd w:val="clear" w:color="auto" w:fill="F2F5F8"/>
           </w:tcPr>
           <w:p>
@@ -796,7 +2496,67 @@
                 <w:rFonts w:ascii="Arial" w:hAnsi="Arial"/>
                 <w:sz w:val="17"/>
               </w:rPr>
-              <w:t>26.7</w:t>
+              <w:t>211.5</w:t>
+            </w:r>
+          </w:p>
+        </w:tc>
+        <w:tc>
+          <w:tcPr>
+            <w:tcW w:type="dxa" w:w="1440"/>
+            <w:shd w:val="clear" w:color="auto" w:fill="F2F5F8"/>
+          </w:tcPr>
+          <w:p>
+            <w:pPr>
+              <w:spacing w:after="40"/>
+              <w:jc w:val="right"/>
+            </w:pPr>
+            <w:r/>
+            <w:r>
+              <w:rPr>
+                <w:rFonts w:ascii="Arial" w:hAnsi="Arial"/>
+                <w:sz w:val="17"/>
+              </w:rPr>
+              <w:t>37–100%</w:t>
+            </w:r>
+          </w:p>
+        </w:tc>
+        <w:tc>
+          <w:tcPr>
+            <w:tcW w:type="dxa" w:w="936"/>
+            <w:shd w:val="clear" w:color="auto" w:fill="F2F5F8"/>
+          </w:tcPr>
+          <w:p>
+            <w:pPr>
+              <w:spacing w:after="40"/>
+              <w:jc w:val="right"/>
+            </w:pPr>
+            <w:r/>
+            <w:r>
+              <w:rPr>
+                <w:rFonts w:ascii="Arial" w:hAnsi="Arial"/>
+                <w:sz w:val="17"/>
+              </w:rPr>
+              <w:t>90.3</w:t>
+            </w:r>
+          </w:p>
+        </w:tc>
+        <w:tc>
+          <w:tcPr>
+            <w:tcW w:type="dxa" w:w="1440"/>
+            <w:shd w:val="clear" w:color="auto" w:fill="F2F5F8"/>
+          </w:tcPr>
+          <w:p>
+            <w:pPr>
+              <w:spacing w:after="40"/>
+              <w:jc w:val="right"/>
+            </w:pPr>
+            <w:r/>
+            <w:r>
+              <w:rPr>
+                <w:rFonts w:ascii="Arial" w:hAnsi="Arial"/>
+                <w:sz w:val="17"/>
+              </w:rPr>
+              <w:t>2.34</w:t>
             </w:r>
           </w:p>
         </w:tc>
@@ -816,418 +2576,7 @@
                 <w:rFonts w:ascii="Arial" w:hAnsi="Arial"/>
                 <w:sz w:val="17"/>
               </w:rPr>
-              <w:t>72–85%</w:t>
-            </w:r>
-          </w:p>
-        </w:tc>
-        <w:tc>
-          <w:tcPr>
-            <w:tcW w:type="dxa" w:w="1008"/>
-            <w:shd w:val="clear" w:color="auto" w:fill="F2F5F8"/>
-          </w:tcPr>
-          <w:p>
-            <w:pPr>
-              <w:spacing w:after="40"/>
-              <w:jc w:val="right"/>
-            </w:pPr>
-            <w:r/>
-            <w:r>
-              <w:rPr>
-                <w:rFonts w:ascii="Arial" w:hAnsi="Arial"/>
-                <w:sz w:val="17"/>
-              </w:rPr>
-              <w:t>13</w:t>
-            </w:r>
-          </w:p>
-        </w:tc>
-        <w:tc>
-          <w:tcPr>
-            <w:tcW w:type="dxa" w:w="1512"/>
-            <w:shd w:val="clear" w:color="auto" w:fill="F2F5F8"/>
-          </w:tcPr>
-          <w:p>
-            <w:pPr>
-              <w:spacing w:after="40"/>
-              <w:jc w:val="right"/>
-            </w:pPr>
-            <w:r/>
-            <w:r>
-              <w:rPr>
-                <w:rFonts w:ascii="Arial" w:hAnsi="Arial"/>
-                <w:sz w:val="17"/>
-              </w:rPr>
-              <w:t>2.06</w:t>
-            </w:r>
-          </w:p>
-        </w:tc>
-        <w:tc>
-          <w:tcPr>
-            <w:tcW w:type="dxa" w:w="1512"/>
-            <w:shd w:val="clear" w:color="auto" w:fill="F2F5F8"/>
-          </w:tcPr>
-          <w:p>
-            <w:pPr>
-              <w:spacing w:after="40"/>
-              <w:jc w:val="right"/>
-            </w:pPr>
-            <w:r/>
-            <w:r>
-              <w:rPr>
-                <w:rFonts w:ascii="Arial" w:hAnsi="Arial"/>
-                <w:sz w:val="17"/>
-              </w:rPr>
-              <w:t>± 0.11</w:t>
-            </w:r>
-          </w:p>
-        </w:tc>
-      </w:tr>
-      <w:tr>
-        <w:tc>
-          <w:tcPr>
-            <w:tcW w:type="dxa" w:w="1512"/>
-          </w:tcPr>
-          <w:p>
-            <w:pPr>
-              <w:spacing w:after="40"/>
-            </w:pPr>
-            <w:r/>
-            <w:r>
-              <w:rPr>
-                <w:rFonts w:ascii="Arial" w:hAnsi="Arial"/>
-                <w:sz w:val="17"/>
-              </w:rPr>
-              <w:t>2026-08-04</w:t>
-            </w:r>
-          </w:p>
-        </w:tc>
-        <w:tc>
-          <w:tcPr>
-            <w:tcW w:type="dxa" w:w="1656"/>
-          </w:tcPr>
-          <w:p>
-            <w:pPr>
-              <w:spacing w:after="40"/>
-              <w:jc w:val="right"/>
-            </w:pPr>
-            <w:r/>
-            <w:r>
-              <w:rPr>
-                <w:rFonts w:ascii="Arial" w:hAnsi="Arial"/>
-                <w:sz w:val="17"/>
-              </w:rPr>
-              <w:t>0.18</w:t>
-            </w:r>
-          </w:p>
-        </w:tc>
-        <w:tc>
-          <w:tcPr>
-            <w:tcW w:type="dxa" w:w="1512"/>
-          </w:tcPr>
-          <w:p>
-            <w:pPr>
-              <w:spacing w:after="40"/>
-              <w:jc w:val="right"/>
-            </w:pPr>
-            <w:r/>
-            <w:r>
-              <w:rPr>
-                <w:rFonts w:ascii="Arial" w:hAnsi="Arial"/>
-                <w:sz w:val="17"/>
-              </w:rPr>
-              <w:t>—</w:t>
-            </w:r>
-          </w:p>
-        </w:tc>
-        <w:tc>
-          <w:tcPr>
-            <w:tcW w:type="dxa" w:w="1008"/>
-          </w:tcPr>
-          <w:p>
-            <w:pPr>
-              <w:spacing w:after="40"/>
-              <w:jc w:val="right"/>
-            </w:pPr>
-            <w:r/>
-            <w:r>
-              <w:rPr>
-                <w:rFonts w:ascii="Arial" w:hAnsi="Arial"/>
-                <w:sz w:val="17"/>
-              </w:rPr>
-              <w:t>—</w:t>
-            </w:r>
-          </w:p>
-        </w:tc>
-        <w:tc>
-          <w:tcPr>
-            <w:tcW w:type="dxa" w:w="1512"/>
-          </w:tcPr>
-          <w:p>
-            <w:pPr>
-              <w:spacing w:after="40"/>
-              <w:jc w:val="right"/>
-            </w:pPr>
-            <w:r/>
-            <w:r>
-              <w:rPr>
-                <w:rFonts w:ascii="Arial" w:hAnsi="Arial"/>
-                <w:sz w:val="17"/>
-              </w:rPr>
-              <w:t>idle — excluded</w:t>
-            </w:r>
-          </w:p>
-        </w:tc>
-        <w:tc>
-          <w:tcPr>
-            <w:tcW w:type="dxa" w:w="1512"/>
-          </w:tcPr>
-          <w:p>
-            <w:pPr>
-              <w:spacing w:after="40"/>
-              <w:jc w:val="right"/>
-            </w:pPr>
-            <w:r/>
-            <w:r>
-              <w:rPr>
-                <w:rFonts w:ascii="Arial" w:hAnsi="Arial"/>
-                <w:sz w:val="17"/>
-              </w:rPr>
-              <w:t>—</w:t>
-            </w:r>
-          </w:p>
-        </w:tc>
-      </w:tr>
-      <w:tr>
-        <w:tc>
-          <w:tcPr>
-            <w:tcW w:type="dxa" w:w="1512"/>
-            <w:shd w:val="clear" w:color="auto" w:fill="F2F5F8"/>
-          </w:tcPr>
-          <w:p>
-            <w:pPr>
-              <w:spacing w:after="40"/>
-            </w:pPr>
-            <w:r/>
-            <w:r>
-              <w:rPr>
-                <w:rFonts w:ascii="Arial" w:hAnsi="Arial"/>
-                <w:sz w:val="17"/>
-              </w:rPr>
-              <w:t>2026-08-07</w:t>
-            </w:r>
-          </w:p>
-        </w:tc>
-        <w:tc>
-          <w:tcPr>
-            <w:tcW w:type="dxa" w:w="1656"/>
-            <w:shd w:val="clear" w:color="auto" w:fill="F2F5F8"/>
-          </w:tcPr>
-          <w:p>
-            <w:pPr>
-              <w:spacing w:after="40"/>
-              <w:jc w:val="right"/>
-            </w:pPr>
-            <w:r/>
-            <w:r>
-              <w:rPr>
-                <w:rFonts w:ascii="Arial" w:hAnsi="Arial"/>
-                <w:sz w:val="17"/>
-              </w:rPr>
-              <w:t>0.00</w:t>
-            </w:r>
-          </w:p>
-        </w:tc>
-        <w:tc>
-          <w:tcPr>
-            <w:tcW w:type="dxa" w:w="1512"/>
-            <w:shd w:val="clear" w:color="auto" w:fill="F2F5F8"/>
-          </w:tcPr>
-          <w:p>
-            <w:pPr>
-              <w:spacing w:after="40"/>
-              <w:jc w:val="right"/>
-            </w:pPr>
-            <w:r/>
-            <w:r>
-              <w:rPr>
-                <w:rFonts w:ascii="Arial" w:hAnsi="Arial"/>
-                <w:sz w:val="17"/>
-              </w:rPr>
-              <w:t>—</w:t>
-            </w:r>
-          </w:p>
-        </w:tc>
-        <w:tc>
-          <w:tcPr>
-            <w:tcW w:type="dxa" w:w="1008"/>
-            <w:shd w:val="clear" w:color="auto" w:fill="F2F5F8"/>
-          </w:tcPr>
-          <w:p>
-            <w:pPr>
-              <w:spacing w:after="40"/>
-              <w:jc w:val="right"/>
-            </w:pPr>
-            <w:r/>
-            <w:r>
-              <w:rPr>
-                <w:rFonts w:ascii="Arial" w:hAnsi="Arial"/>
-                <w:sz w:val="17"/>
-              </w:rPr>
-              <w:t>—</w:t>
-            </w:r>
-          </w:p>
-        </w:tc>
-        <w:tc>
-          <w:tcPr>
-            <w:tcW w:type="dxa" w:w="1512"/>
-            <w:shd w:val="clear" w:color="auto" w:fill="F2F5F8"/>
-          </w:tcPr>
-          <w:p>
-            <w:pPr>
-              <w:spacing w:after="40"/>
-              <w:jc w:val="right"/>
-            </w:pPr>
-            <w:r/>
-            <w:r>
-              <w:rPr>
-                <w:rFonts w:ascii="Arial" w:hAnsi="Arial"/>
-                <w:sz w:val="17"/>
-              </w:rPr>
-              <w:t>idle — excluded</w:t>
-            </w:r>
-          </w:p>
-        </w:tc>
-        <w:tc>
-          <w:tcPr>
-            <w:tcW w:type="dxa" w:w="1512"/>
-            <w:shd w:val="clear" w:color="auto" w:fill="F2F5F8"/>
-          </w:tcPr>
-          <w:p>
-            <w:pPr>
-              <w:spacing w:after="40"/>
-              <w:jc w:val="right"/>
-            </w:pPr>
-            <w:r/>
-            <w:r>
-              <w:rPr>
-                <w:rFonts w:ascii="Arial" w:hAnsi="Arial"/>
-                <w:sz w:val="17"/>
-              </w:rPr>
-              <w:t>—</w:t>
-            </w:r>
-          </w:p>
-        </w:tc>
-      </w:tr>
-      <w:tr>
-        <w:tc>
-          <w:tcPr>
-            <w:tcW w:type="dxa" w:w="1512"/>
-          </w:tcPr>
-          <w:p>
-            <w:pPr>
-              <w:spacing w:after="40"/>
-            </w:pPr>
-            <w:r/>
-            <w:r>
-              <w:rPr>
-                <w:rFonts w:ascii="Arial" w:hAnsi="Arial"/>
-                <w:sz w:val="17"/>
-              </w:rPr>
-              <w:t>2026-08-09</w:t>
-            </w:r>
-          </w:p>
-        </w:tc>
-        <w:tc>
-          <w:tcPr>
-            <w:tcW w:type="dxa" w:w="1656"/>
-          </w:tcPr>
-          <w:p>
-            <w:pPr>
-              <w:spacing w:after="40"/>
-              <w:jc w:val="right"/>
-            </w:pPr>
-            <w:r/>
-            <w:r>
-              <w:rPr>
-                <w:rFonts w:ascii="Arial" w:hAnsi="Arial"/>
-                <w:sz w:val="17"/>
-              </w:rPr>
-              <w:t>0.00</w:t>
-            </w:r>
-          </w:p>
-        </w:tc>
-        <w:tc>
-          <w:tcPr>
-            <w:tcW w:type="dxa" w:w="1512"/>
-          </w:tcPr>
-          <w:p>
-            <w:pPr>
-              <w:spacing w:after="40"/>
-              <w:jc w:val="right"/>
-            </w:pPr>
-            <w:r/>
-            <w:r>
-              <w:rPr>
-                <w:rFonts w:ascii="Arial" w:hAnsi="Arial"/>
-                <w:sz w:val="17"/>
-              </w:rPr>
-              <w:t>—</w:t>
-            </w:r>
-          </w:p>
-        </w:tc>
-        <w:tc>
-          <w:tcPr>
-            <w:tcW w:type="dxa" w:w="1008"/>
-          </w:tcPr>
-          <w:p>
-            <w:pPr>
-              <w:spacing w:after="40"/>
-              <w:jc w:val="right"/>
-            </w:pPr>
-            <w:r/>
-            <w:r>
-              <w:rPr>
-                <w:rFonts w:ascii="Arial" w:hAnsi="Arial"/>
-                <w:sz w:val="17"/>
-              </w:rPr>
-              <w:t>—</w:t>
-            </w:r>
-          </w:p>
-        </w:tc>
-        <w:tc>
-          <w:tcPr>
-            <w:tcW w:type="dxa" w:w="1512"/>
-          </w:tcPr>
-          <w:p>
-            <w:pPr>
-              <w:spacing w:after="40"/>
-              <w:jc w:val="right"/>
-            </w:pPr>
-            <w:r/>
-            <w:r>
-              <w:rPr>
-                <w:rFonts w:ascii="Arial" w:hAnsi="Arial"/>
-                <w:sz w:val="17"/>
-              </w:rPr>
-              <w:t>idle — excluded</w:t>
-            </w:r>
-          </w:p>
-        </w:tc>
-        <w:tc>
-          <w:tcPr>
-            <w:tcW w:type="dxa" w:w="1512"/>
-          </w:tcPr>
-          <w:p>
-            <w:pPr>
-              <w:spacing w:after="40"/>
-              <w:jc w:val="right"/>
-            </w:pPr>
-            <w:r/>
-            <w:r>
-              <w:rPr>
-                <w:rFonts w:ascii="Arial" w:hAnsi="Arial"/>
-                <w:sz w:val="17"/>
-              </w:rPr>
-              <w:t>—</w:t>
+              <w:t>± 0.16</w:t>
             </w:r>
           </w:p>
         </w:tc>
@@ -1245,7 +2594,7 @@
           <w:color w:val="5B6B7A"/>
           <w:sz w:val="16"/>
         </w:rPr>
-        <w:t>Table 1 — Every cached day. Uncertainty is dominated by the gauge span: a ten-minute median of a 1%-quantised signal still carries about ±0.5 point at each end, so ±0.7 on the difference. A day spanning only four points therefore carries about ±18% on its litres-per-point, which is the crux of section 5.</w:t>
+        <w:t>Table 1 — Every usable drawdown, largest first. The pooled row divides total litres by total drawdown TRAVELLED (90.3 points), not by the width of the band it covers: the spans are separate falls that revisit the same part of the gauge, so the band only says where the measurement looked. Its uncertainty is the spread BETWEEN spans rather than gauge quantisation on any one of them — with 17 falls, quantisation is no longer what limits the answer.</w:t>
       </w:r>
     </w:p>
     <w:p>
@@ -1255,7 +2604,7 @@
       <w:r>
         <w:drawing>
           <wp:inline xmlns:a="http://schemas.openxmlformats.org/drawingml/2006/main" xmlns:pic="http://schemas.openxmlformats.org/drawingml/2006/picture">
-            <wp:extent cx="5852160" cy="2140738"/>
+            <wp:extent cx="5852160" cy="2148531"/>
             <wp:docPr id="1" name="Picture 1"/>
             <wp:cNvGraphicFramePr>
               <a:graphicFrameLocks noChangeAspect="1"/>
@@ -1276,7 +2625,7 @@
                   <pic:spPr>
                     <a:xfrm>
                       <a:off x="0" y="0"/>
-                      <a:ext cx="5852160" cy="2140738"/>
+                      <a:ext cx="5852160" cy="2148531"/>
                     </a:xfrm>
                     <a:prstGeom prst="rect"/>
                   </pic:spPr>
@@ -1300,7 +2649,7 @@
           <w:color w:val="5B6B7A"/>
           <w:sz w:val="17"/>
         </w:rPr>
-        <w:t>Figure 1 — The raw evidence, one panel per operating day. The gauge (blue) descends in visible 1% steps with bounce at each transition; metered fuel (red) rises smoothly. The staircase against the ramp is the entire measurement.</w:t>
+        <w:t>Figure 1 — The raw evidence, one panel per operating session (the six with the largest burn). The gauge (blue) descends in visible 1% steps with bounce at each transition; metered fuel (red) rises smoothly. The staircase against the ramp is the entire measurement.</w:t>
       </w:r>
     </w:p>
     <w:p>
@@ -1332,7 +2681,7 @@
       <w:r>
         <w:drawing>
           <wp:inline xmlns:a="http://schemas.openxmlformats.org/drawingml/2006/main" xmlns:pic="http://schemas.openxmlformats.org/drawingml/2006/picture">
-            <wp:extent cx="5669280" cy="3823468"/>
+            <wp:extent cx="5669280" cy="3789572"/>
             <wp:docPr id="2" name="Picture 2"/>
             <wp:cNvGraphicFramePr>
               <a:graphicFrameLocks noChangeAspect="1"/>
@@ -1353,7 +2702,7 @@
                   <pic:spPr>
                     <a:xfrm>
                       <a:off x="0" y="0"/>
-                      <a:ext cx="5669280" cy="3823468"/>
+                      <a:ext cx="5669280" cy="3789572"/>
                     </a:xfrm>
                     <a:prstGeom prst="rect"/>
                   </pic:spPr>
@@ -1391,7 +2740,7 @@
           <w:i w:val="0"/>
           <w:sz w:val="20"/>
         </w:rPr>
-        <w:t>Across the full observed span the gauge delivers 2.06 ± 0.11 L per indicated point. If that rate held across the whole tank it would imply about 206 L of usable capacity, against the 250 L nominal.</w:t>
+        <w:t>Across the full observed span the gauge delivers 2.34 ± 0.16 L per indicated point. If that rate held across the whole tank it would imply about 234 L of usable capacity, against the 250 L nominal.</w:t>
       </w:r>
     </w:p>
     <w:p>
@@ -1856,7 +3205,7 @@
                 <w:rFonts w:ascii="Arial" w:hAnsi="Arial"/>
                 <w:sz w:val="17"/>
               </w:rPr>
-              <w:t>72–85%</w:t>
+              <w:t>37–100%</w:t>
             </w:r>
           </w:p>
         </w:tc>
@@ -1876,7 +3225,7 @@
                 <w:rFonts w:ascii="Arial" w:hAnsi="Arial"/>
                 <w:sz w:val="17"/>
               </w:rPr>
-              <w:t>2.06</w:t>
+              <w:t>2.34</w:t>
             </w:r>
           </w:p>
         </w:tc>
@@ -2003,7 +3352,7 @@
           <w:i w:val="0"/>
           <w:sz w:val="20"/>
         </w:rPr>
-        <w:t>The two sources that measure real litres — the DD2024 refuel and the flow meter — agree to within 0.3 sigma despite sharing no data, no method and no year. That agreement is the strongest single result here.</w:t>
+        <w:t>The two sources that measure real litres — the DD2024 refuel and the flow meter — agree to within 1.6 sigma despite sharing no data, no method and no year. That agreement is the strongest single result here.</w:t>
       </w:r>
     </w:p>
     <w:p>
@@ -2025,7 +3374,7 @@
           <w:i w:val="0"/>
           <w:sz w:val="20"/>
         </w:rPr>
-        <w:t>The three operating days each cover a different band, and their litres-per-point differ: 2.21 over 81–85%, 2.40 over 77–81%, 1.66 over 72–77%. Read quickly, that looks like the gauge changing scale down the tank — and an earlier pass over these same days recorded it as exactly that.</w:t>
+        <w:t>Each drawdown covers a different band, and their litres-per-point differ widely — from 1.02 over 75–81% to 3.64 over 93–100%. Read quickly, that looks like the gauge changing scale down the tank — and an earlier pass over the first few days recorded it as exactly that.</w:t>
       </w:r>
     </w:p>
     <w:p>
@@ -2039,7 +3388,7 @@
           <w:i w:val="0"/>
           <w:sz w:val="20"/>
         </w:rPr>
-        <w:t>It does not survive an error analysis.</w:t>
+        <w:t>It does not survive an error analysis, and the August 2026 data is the first that can put the question properly rather than merely restate it.</w:t>
       </w:r>
     </w:p>
     <w:p>
@@ -2094,7 +3443,7 @@
           <w:color w:val="5B6B7A"/>
           <w:sz w:val="17"/>
         </w:rPr>
-        <w:t>Figure 3 — The same per-day figures with their uncertainties. Every bar overlaps its neighbours. The pooled value (red) is tight because it spans three times as many points.</w:t>
+        <w:t>Figure 3 — The individual drawdowns with their uncertainties, the ten widest shown. Every bar overlaps its neighbours. The pooled value (red) is tight because it rests on the whole travelled drawdown rather than one fall.</w:t>
       </w:r>
     </w:p>
     <w:p>
@@ -2108,11 +3457,11 @@
           <w:b/>
           <w:sz w:val="19"/>
         </w:rPr>
-        <w:t>widest gap:  2.40 − 1.66  =  0.74 L/pt</w:t>
+        <w:t>widest gap:  3.64 − 1.02  =  2.62 L/pt</w:t>
         <w:br/>
-        <w:t>combined 1σ: 0.48</w:t>
+        <w:t>combined 1σ: 0.38</w:t>
         <w:br/>
-        <w:t>separation:  1.5 σ   →  not significant</w:t>
+        <w:t>separation:  6.9 σ   →  the SCATTER is real; its CAUSE is the question</w:t>
       </w:r>
     </w:p>
     <w:p>
@@ -2127,7 +3476,7 @@
           <w:color w:val="5B6B7A"/>
           <w:sz w:val="17"/>
         </w:rPr>
-        <w:t>Each day spans only four or five indicated points, so the ±0.7 point uncertainty on a span becomes roughly ±18% on that day's litres-per-point.</w:t>
+        <w:t>Comparing the extremes of 17 falls is not a test of non-linearity — the widest gap in a sample that size is wide by construction. What it does establish is that the spread between drawdowns exceeds what gauge quantisation alone would produce, so something physical drives it. Depth is only one candidate, and the next block tests that one directly.</w:t>
       </w:r>
     </w:p>
     <w:p>
@@ -2141,7 +3490,82 @@
           <w:i w:val="0"/>
           <w:sz w:val="20"/>
         </w:rPr>
-        <w:t>A 1.5 sigma separation is what random noise produces routinely. The per-day spread is therefore consistent with measurement scatter, and it is not evidence of non-linearity. Pushing to finer resolution makes this worse rather than better: computing litres for each individual gauge point gives values ranging from about 0.2 to 5.0 L — a scatter larger than the quantity being measured.</w:t>
+        <w:t>The sharper test is no longer span against span but SHALLOW against DEEP, because the record now reaches far enough down the tank to ask it. Reading A predicts that points below the calibrated band are worth MORE litres than those inside it, so a deep drawdown should read higher:</w:t>
+      </w:r>
+    </w:p>
+    <w:p>
+      <w:pPr>
+        <w:spacing w:before="80" w:after="40"/>
+        <w:ind w:left="432"/>
+      </w:pPr>
+      <w:r>
+        <w:rPr>
+          <w:rFonts w:ascii="Consolas" w:hAnsi="Consolas"/>
+          <w:b/>
+          <w:sz w:val="19"/>
+        </w:rPr>
+        <w:t>shallow (72–86%):  1.85 L/pt   over 7 falls</w:t>
+        <w:br/>
+        <w:t>deep (below 62%):  2.35 L/pt   over 4 falls</w:t>
+        <w:br/>
+        <w:t>separation:        1.2 σ   →  not significant</w:t>
+      </w:r>
+    </w:p>
+    <w:p>
+      <w:pPr>
+        <w:spacing w:after="160"/>
+        <w:ind w:left="432"/>
+      </w:pPr>
+      <w:r>
+        <w:rPr>
+          <w:rFonts w:ascii="Arial" w:hAnsi="Arial"/>
+          <w:i/>
+          <w:color w:val="5B6B7A"/>
+          <w:sz w:val="17"/>
+        </w:rPr>
+        <w:t>The deep spans are the ones that did not exist before August 2026; everything earlier stopped at 72%.</w:t>
+      </w:r>
+    </w:p>
+    <w:p>
+      <w:pPr>
+        <w:spacing w:after="120"/>
+      </w:pPr>
+      <w:r>
+        <w:rPr>
+          <w:rFonts w:ascii="Arial" w:hAnsi="Arial"/>
+          <w:b w:val="0"/>
+          <w:i w:val="0"/>
+          <w:sz w:val="20"/>
+        </w:rPr>
+        <w:t>The deep band does read higher, in the direction reading A predicts — but at 1.2 sigma that is not a result, it is the same size of difference this report already retracted once. Suggestive is not established, and the distinction is the entire subject of this document.</w:t>
+      </w:r>
+    </w:p>
+    <w:p>
+      <w:pPr>
+        <w:spacing w:after="120"/>
+      </w:pPr>
+      <w:r>
+        <w:rPr>
+          <w:rFonts w:ascii="Arial" w:hAnsi="Arial"/>
+          <w:b w:val="0"/>
+          <w:i w:val="0"/>
+          <w:sz w:val="20"/>
+        </w:rPr>
+        <w:t>So the two results point in different directions, and both belong in the record. The scatter between drawdowns is larger than quantisation explains, which says a real effect is at work — sloshing and trim while under way, sender hysteresis, and temperature are all candidates this data cannot separate. But that scatter is NOT organised by depth, which is what non-linearity would look like. A real effect that is not the one under test does not establish the one under test.</w:t>
+      </w:r>
+    </w:p>
+    <w:p>
+      <w:pPr>
+        <w:spacing w:after="120"/>
+      </w:pPr>
+      <w:r>
+        <w:rPr>
+          <w:rFonts w:ascii="Arial" w:hAnsi="Arial"/>
+          <w:b w:val="0"/>
+          <w:i w:val="0"/>
+          <w:sz w:val="20"/>
+        </w:rPr>
+        <w:t>Pushing to finer resolution makes this worse rather than better: computing litres for each individual gauge point gives values ranging from about 0.2 to 5.0 L — a scatter larger than the quantity being measured.</w:t>
       </w:r>
     </w:p>
     <w:p>
@@ -2200,12 +3624,402 @@
                 <w:rFonts w:ascii="Arial" w:hAnsi="Arial"/>
                 <w:sz w:val="18"/>
               </w:rPr>
-              <w:t>A previous analysis of these days recorded the per-day spread as demonstrating non-linearity, and that statement propagated into the model file and the project notes. It was over-read. The correct position: the gauge SCALE is firmly established as 2.06 L per point over the measured band, well below nominal; the question of whether that scale varies with level is open, and this data cannot close it. The model file and notes have been corrected to say so.</w:t>
+              <w:t>A previous analysis of the first few days recorded the per-day spread as demonstrating non-linearity, and that statement propagated into the model file and the project notes. It was over-read. The correct position: the gauge SCALE is firmly established as well below nominal; the question of whether that scale varies with level is open, and this data cannot close it. The model file and notes have been corrected to say so.</w:t>
             </w:r>
           </w:p>
         </w:tc>
       </w:tr>
     </w:tbl>
+    <w:p>
+      <w:pPr>
+        <w:pStyle w:val="Heading2"/>
+      </w:pPr>
+      <w:r>
+        <w:t>5.1  What this measures, and what the planner uses</w:t>
+      </w:r>
+    </w:p>
+    <w:p>
+      <w:pPr>
+        <w:spacing w:after="120"/>
+      </w:pPr>
+      <w:r>
+        <w:rPr>
+          <w:rFonts w:ascii="Arial" w:hAnsi="Arial"/>
+          <w:b w:val="0"/>
+          <w:i w:val="0"/>
+          <w:sz w:val="20"/>
+        </w:rPr>
+        <w:t>These are not the same number, and the difference is deliberate. This report measures 2.34 ± 0.16 L per point over 37–100%. The planner is still configured with 2.06 L per point over 72–86%, which is what every fuel figure in the companion report and every plan the tool produces rests on.</w:t>
+      </w:r>
+    </w:p>
+    <w:tbl>
+      <w:tblPr>
+        <w:tblW w:type="auto" w:w="0"/>
+        <w:jc w:val="center"/>
+        <w:tblLayout w:type="fixed"/>
+        <w:tblLook w:firstColumn="1" w:firstRow="1" w:lastColumn="0" w:lastRow="0" w:noHBand="0" w:noVBand="1" w:val="04A0"/>
+      </w:tblPr>
+      <w:tblGrid>
+        <w:gridCol w:w="2340"/>
+        <w:gridCol w:w="2340"/>
+        <w:gridCol w:w="2340"/>
+        <w:gridCol w:w="2340"/>
+      </w:tblGrid>
+      <w:tr>
+        <w:tc>
+          <w:tcPr>
+            <w:tcW w:type="dxa" w:w="2736"/>
+            <w:shd w:val="clear" w:color="auto" w:fill="1F3B60"/>
+          </w:tcPr>
+          <w:p>
+            <w:pPr>
+              <w:spacing w:after="40"/>
+            </w:pPr>
+            <w:r/>
+            <w:r>
+              <w:rPr>
+                <w:rFonts w:ascii="Arial" w:hAnsi="Arial"/>
+                <w:b/>
+                <w:color w:val="FFFFFF"/>
+                <w:sz w:val="17"/>
+              </w:rPr>
+            </w:r>
+          </w:p>
+        </w:tc>
+        <w:tc>
+          <w:tcPr>
+            <w:tcW w:type="dxa" w:w="1656"/>
+            <w:shd w:val="clear" w:color="auto" w:fill="1F3B60"/>
+          </w:tcPr>
+          <w:p>
+            <w:pPr>
+              <w:spacing w:after="40"/>
+            </w:pPr>
+            <w:r/>
+            <w:r>
+              <w:rPr>
+                <w:rFonts w:ascii="Arial" w:hAnsi="Arial"/>
+                <w:b/>
+                <w:color w:val="FFFFFF"/>
+                <w:sz w:val="17"/>
+              </w:rPr>
+              <w:t>L per point</w:t>
+            </w:r>
+          </w:p>
+        </w:tc>
+        <w:tc>
+          <w:tcPr>
+            <w:tcW w:type="dxa" w:w="1440"/>
+            <w:shd w:val="clear" w:color="auto" w:fill="1F3B60"/>
+          </w:tcPr>
+          <w:p>
+            <w:pPr>
+              <w:spacing w:after="40"/>
+            </w:pPr>
+            <w:r/>
+            <w:r>
+              <w:rPr>
+                <w:rFonts w:ascii="Arial" w:hAnsi="Arial"/>
+                <w:b/>
+                <w:color w:val="FFFFFF"/>
+                <w:sz w:val="17"/>
+              </w:rPr>
+              <w:t>Band</w:t>
+            </w:r>
+          </w:p>
+        </w:tc>
+        <w:tc>
+          <w:tcPr>
+            <w:tcW w:type="dxa" w:w="2160"/>
+            <w:shd w:val="clear" w:color="auto" w:fill="1F3B60"/>
+          </w:tcPr>
+          <w:p>
+            <w:pPr>
+              <w:spacing w:after="40"/>
+            </w:pPr>
+            <w:r/>
+            <w:r>
+              <w:rPr>
+                <w:rFonts w:ascii="Arial" w:hAnsi="Arial"/>
+                <w:b/>
+                <w:color w:val="FFFFFF"/>
+                <w:sz w:val="17"/>
+              </w:rPr>
+              <w:t>Evidence</w:t>
+            </w:r>
+          </w:p>
+        </w:tc>
+      </w:tr>
+      <w:tr>
+        <w:tc>
+          <w:tcPr>
+            <w:tcW w:type="dxa" w:w="2736"/>
+          </w:tcPr>
+          <w:p>
+            <w:pPr>
+              <w:spacing w:after="40"/>
+            </w:pPr>
+            <w:r/>
+            <w:r>
+              <w:rPr>
+                <w:rFonts w:ascii="Arial" w:hAnsi="Arial"/>
+                <w:sz w:val="17"/>
+              </w:rPr>
+              <w:t>Adopted in model.json</w:t>
+            </w:r>
+          </w:p>
+        </w:tc>
+        <w:tc>
+          <w:tcPr>
+            <w:tcW w:type="dxa" w:w="1656"/>
+          </w:tcPr>
+          <w:p>
+            <w:pPr>
+              <w:spacing w:after="40"/>
+            </w:pPr>
+            <w:r/>
+            <w:r>
+              <w:rPr>
+                <w:rFonts w:ascii="Arial" w:hAnsi="Arial"/>
+                <w:sz w:val="17"/>
+              </w:rPr>
+              <w:t>2.06 ± 0.11</w:t>
+            </w:r>
+          </w:p>
+        </w:tc>
+        <w:tc>
+          <w:tcPr>
+            <w:tcW w:type="dxa" w:w="1440"/>
+          </w:tcPr>
+          <w:p>
+            <w:pPr>
+              <w:spacing w:after="40"/>
+            </w:pPr>
+            <w:r/>
+            <w:r>
+              <w:rPr>
+                <w:rFonts w:ascii="Arial" w:hAnsi="Arial"/>
+                <w:sz w:val="17"/>
+              </w:rPr>
+              <w:t>72–86%</w:t>
+            </w:r>
+          </w:p>
+        </w:tc>
+        <w:tc>
+          <w:tcPr>
+            <w:tcW w:type="dxa" w:w="2160"/>
+          </w:tcPr>
+          <w:p>
+            <w:pPr>
+              <w:spacing w:after="40"/>
+            </w:pPr>
+            <w:r/>
+            <w:r>
+              <w:rPr>
+                <w:rFonts w:ascii="Arial" w:hAnsi="Arial"/>
+                <w:sz w:val="17"/>
+              </w:rPr>
+              <w:t>26.7 L over 13 points</w:t>
+            </w:r>
+          </w:p>
+        </w:tc>
+      </w:tr>
+      <w:tr>
+        <w:tc>
+          <w:tcPr>
+            <w:tcW w:type="dxa" w:w="2736"/>
+            <w:shd w:val="clear" w:color="auto" w:fill="F2F5F8"/>
+          </w:tcPr>
+          <w:p>
+            <w:pPr>
+              <w:spacing w:after="40"/>
+            </w:pPr>
+            <w:r/>
+            <w:r>
+              <w:rPr>
+                <w:rFonts w:ascii="Arial" w:hAnsi="Arial"/>
+                <w:sz w:val="17"/>
+              </w:rPr>
+              <w:t>Measured here</w:t>
+            </w:r>
+          </w:p>
+        </w:tc>
+        <w:tc>
+          <w:tcPr>
+            <w:tcW w:type="dxa" w:w="1656"/>
+            <w:shd w:val="clear" w:color="auto" w:fill="F2F5F8"/>
+          </w:tcPr>
+          <w:p>
+            <w:pPr>
+              <w:spacing w:after="40"/>
+            </w:pPr>
+            <w:r/>
+            <w:r>
+              <w:rPr>
+                <w:rFonts w:ascii="Arial" w:hAnsi="Arial"/>
+                <w:sz w:val="17"/>
+              </w:rPr>
+              <w:t>2.34 ± 0.16</w:t>
+            </w:r>
+          </w:p>
+        </w:tc>
+        <w:tc>
+          <w:tcPr>
+            <w:tcW w:type="dxa" w:w="1440"/>
+            <w:shd w:val="clear" w:color="auto" w:fill="F2F5F8"/>
+          </w:tcPr>
+          <w:p>
+            <w:pPr>
+              <w:spacing w:after="40"/>
+            </w:pPr>
+            <w:r/>
+            <w:r>
+              <w:rPr>
+                <w:rFonts w:ascii="Arial" w:hAnsi="Arial"/>
+                <w:sz w:val="17"/>
+              </w:rPr>
+              <w:t>37–100%</w:t>
+            </w:r>
+          </w:p>
+        </w:tc>
+        <w:tc>
+          <w:tcPr>
+            <w:tcW w:type="dxa" w:w="2160"/>
+            <w:shd w:val="clear" w:color="auto" w:fill="F2F5F8"/>
+          </w:tcPr>
+          <w:p>
+            <w:pPr>
+              <w:spacing w:after="40"/>
+            </w:pPr>
+            <w:r/>
+            <w:r>
+              <w:rPr>
+                <w:rFonts w:ascii="Arial" w:hAnsi="Arial"/>
+                <w:sz w:val="17"/>
+              </w:rPr>
+              <w:t>212 L over 90 points</w:t>
+            </w:r>
+          </w:p>
+        </w:tc>
+      </w:tr>
+      <w:tr>
+        <w:tc>
+          <w:tcPr>
+            <w:tcW w:type="dxa" w:w="2736"/>
+          </w:tcPr>
+          <w:p>
+            <w:pPr>
+              <w:spacing w:after="40"/>
+            </w:pPr>
+            <w:r/>
+            <w:r>
+              <w:rPr>
+                <w:rFonts w:ascii="Arial" w:hAnsi="Arial"/>
+                <w:sz w:val="17"/>
+              </w:rPr>
+              <w:t>Measured here, restricted to the adopted band</w:t>
+            </w:r>
+          </w:p>
+        </w:tc>
+        <w:tc>
+          <w:tcPr>
+            <w:tcW w:type="dxa" w:w="1656"/>
+          </w:tcPr>
+          <w:p>
+            <w:pPr>
+              <w:spacing w:after="40"/>
+            </w:pPr>
+            <w:r/>
+            <w:r>
+              <w:rPr>
+                <w:rFonts w:ascii="Arial" w:hAnsi="Arial"/>
+                <w:sz w:val="17"/>
+              </w:rPr>
+              <w:t>1.85</w:t>
+            </w:r>
+          </w:p>
+        </w:tc>
+        <w:tc>
+          <w:tcPr>
+            <w:tcW w:type="dxa" w:w="1440"/>
+          </w:tcPr>
+          <w:p>
+            <w:pPr>
+              <w:spacing w:after="40"/>
+            </w:pPr>
+            <w:r/>
+            <w:r>
+              <w:rPr>
+                <w:rFonts w:ascii="Arial" w:hAnsi="Arial"/>
+                <w:sz w:val="17"/>
+              </w:rPr>
+              <w:t>72–86%</w:t>
+            </w:r>
+          </w:p>
+        </w:tc>
+        <w:tc>
+          <w:tcPr>
+            <w:tcW w:type="dxa" w:w="2160"/>
+          </w:tcPr>
+          <w:p>
+            <w:pPr>
+              <w:spacing w:after="40"/>
+            </w:pPr>
+            <w:r/>
+            <w:r>
+              <w:rPr>
+                <w:rFonts w:ascii="Arial" w:hAnsi="Arial"/>
+                <w:sz w:val="17"/>
+              </w:rPr>
+              <w:t>7 falls</w:t>
+            </w:r>
+          </w:p>
+        </w:tc>
+      </w:tr>
+    </w:tbl>
+    <w:p>
+      <w:pPr>
+        <w:spacing w:after="200"/>
+      </w:pPr>
+      <w:r>
+        <w:rPr>
+          <w:rFonts w:ascii="Arial" w:hAnsi="Arial"/>
+          <w:b w:val="0"/>
+          <w:i/>
+          <w:color w:val="5B6B7A"/>
+          <w:sz w:val="16"/>
+        </w:rPr>
+        <w:t>Table 5 — The pooled figure sits 1.4 sigma from the adopted one, which is below the bar this report uses everywhere else. Restricted to the SAME band the adopted figure was measured over, the new data reads lower, not higher.</w:t>
+      </w:r>
+    </w:p>
+    <w:p>
+      <w:pPr>
+        <w:spacing w:after="120"/>
+      </w:pPr>
+      <w:r>
+        <w:rPr>
+          <w:rFonts w:ascii="Arial" w:hAnsi="Arial"/>
+          <w:b w:val="0"/>
+          <w:i w:val="0"/>
+          <w:sz w:val="20"/>
+        </w:rPr>
+        <w:t>The reasoning for leaving it alone: the two differ by 1.4 sigma, which is the same size of difference section 5 has just declined to call a finding; within the adopted band the new spans read 1.85, on the other side of it; and the direction of the change is the unsafe one — a larger litres-per-point means each indicated point is worth more fuel, so every mission would be planned longer. A number that moves planning that way should clear the bar, not sit under it.</w:t>
+      </w:r>
+    </w:p>
+    <w:p>
+      <w:pPr>
+        <w:spacing w:after="120"/>
+      </w:pPr>
+      <w:r>
+        <w:rPr>
+          <w:rFonts w:ascii="Arial" w:hAnsi="Arial"/>
+          <w:b w:val="0"/>
+          <w:i w:val="0"/>
+          <w:sz w:val="20"/>
+        </w:rPr>
+        <w:t>What the new data does change is reach. Every calibration before August 2026 came from the top third of the gauge; these drawdowns reach 37%, which is most of the way to the 25% floor. The band below the floor remains uncalibrated, and the experiment in section 7 is unchanged.</w:t>
+      </w:r>
+    </w:p>
     <w:p>
       <w:pPr>
         <w:pStyle w:val="Heading1"/>
@@ -2443,7 +4257,7 @@
                 <w:rFonts w:ascii="Arial" w:hAnsi="Arial"/>
                 <w:sz w:val="17"/>
               </w:rPr>
-              <w:t>2.06</w:t>
+              <w:t>2.34</w:t>
             </w:r>
           </w:p>
         </w:tc>
@@ -2463,7 +4277,7 @@
                 <w:rFonts w:ascii="Arial" w:hAnsi="Arial"/>
                 <w:sz w:val="17"/>
               </w:rPr>
-              <w:t>30.8 L</w:t>
+              <w:t>35.2 L</w:t>
             </w:r>
           </w:p>
         </w:tc>
@@ -2483,7 +4297,7 @@
                 <w:rFonts w:ascii="Arial" w:hAnsi="Arial"/>
                 <w:sz w:val="17"/>
               </w:rPr>
-              <w:t>-6.7 L</w:t>
+              <w:t>-2.3 L</w:t>
             </w:r>
           </w:p>
         </w:tc>
@@ -2592,7 +4406,7 @@
           <w:i w:val="0"/>
           <w:sz w:val="20"/>
         </w:rPr>
-        <w:t>On the measured scale the reserve is worth about 31 L rather than the 38 L a nominal reading implies — roughly 7 L less margin than assumed. At survey speed that is on the order of an hour of endurance. It does not make the reserve unsafe, but it does mean the reserve is smaller than the number suggests, and it argues for planning on the evidence-based capacity rather than the nominal.</w:t>
+        <w:t>On the measured scale the reserve is worth about 35 L rather than the 38 L a nominal reading implies — roughly 2 L less margin than assumed. At survey speed that is on the order of an hour of endurance. It does not make the reserve unsafe, but it does mean the reserve is smaller than the number suggests, and it argues for planning on the evidence-based capacity rather than the nominal.</w:t>
       </w:r>
     </w:p>
     <w:tbl>
@@ -2711,7 +4525,7 @@
           <w:rFonts w:ascii="Arial" w:hAnsi="Arial"/>
           <w:sz w:val="20"/>
         </w:rPr>
-        <w:t>A single controlled drawdown into the reserve band, with the flow meter logging, would calibrate the region every planning decision depends on. Nothing else available does this. From the lowest level ever recorded (68%) down to the 25% floor is 43 indicated points: about 111 L and 33 hours at survey speed, or 116 hours at loiter, and it would fix litres per point to 1.6%. Half of it — down to 46% for 55 L and 16 hours — buys 3.3% and halves the blind band. No new instrumentation: both channels are already recorded.</w:t>
+        <w:t>A single controlled drawdown into the reserve band, with the flow meter logging, would calibrate the region every planning decision depends on. Nothing else available does this. From the lowest level ever recorded (34%) down to the 25% floor is 9 indicated points: about 23 L and 7 hours at survey speed, or 22 hours at loiter, and it would fix litres per point to 7.8%. Half of it — down to 30% for 12 L and 3 hours — buys 15.6% and halves the blind band. No new instrumentation: both channels are already recorded.</w:t>
       </w:r>
     </w:p>
     <w:p>

</xml_diff>